<commit_message>
Documento de entrega: liga de Git y uso de IA
</commit_message>
<xml_diff>
--- a/Tarea1_A01741456.docx
+++ b/Tarea1_A01741456.docx
@@ -37,7 +37,7 @@
     </w:p>
     <w:p>
       <w:r>
-        <w:t>Liga de Git: GIT_URL_PENDIENTE</w:t>
+        <w:t>Liga de Git: https://github.com/HermannPR/compiladores-ad26</w:t>
       </w:r>
     </w:p>
     <w:p>
@@ -103,7 +103,7 @@
     </w:p>
     <w:p>
       <w:r>
-        <w:t>Herramienta usada: Claude (Anthropic), a través de Claude Code. Claude generó el código, las pruebas y este documento a partir de las instrucciones de Hermann. Hermann revisó el resultado y ejecutó las pruebas.</w:t>
+        <w:t>Herramienta: Claude Code (Anthropic), como asistente de programación. Yo definí lo que necesitaba: las tres estructuras de la tarea en Python, que es el lenguaje que voy a usar en el mini-proyecto, implementadas desde cero y sin librerías, con un programa de demostración enfocado en compiladores (paréntesis balanceados, cola de tokens y tabla de símbolos), pruebas automáticas y comentarios sencillos en el código. Con esas instrucciones la herramienta generó una primera versión del código, de las pruebas y de este documento. Después revisé el código, ejecuté el demo y las 46 pruebas para comprobar cada operación, y lo subí a mi repositorio de Git.</w:t>
       </w:r>
     </w:p>
     <w:p>

</xml_diff>

<commit_message>
Entrega: portada APA y PDF; sin el PDF del enunciado
</commit_message>
<xml_diff>
--- a/Tarea1_A01741456.docx
+++ b/Tarea1_A01741456.docx
@@ -4,35 +4,163 @@
   <w:body>
     <w:p>
       <w:pPr>
+        <w:spacing w:after="0"/>
+        <w:jc w:val="center"/>
+      </w:pPr>
+      <w:r>
+        <w:drawing>
+          <wp:inline xmlns:a="http://schemas.openxmlformats.org/drawingml/2006/main" xmlns:pic="http://schemas.openxmlformats.org/drawingml/2006/picture">
+            <wp:extent cx="1463040" cy="1463040"/>
+            <wp:docPr id="1" name="Picture 1"/>
+            <wp:cNvGraphicFramePr>
+              <a:graphicFrameLocks noChangeAspect="1"/>
+            </wp:cNvGraphicFramePr>
+            <a:graphic>
+              <a:graphicData uri="http://schemas.openxmlformats.org/drawingml/2006/picture">
+                <pic:pic>
+                  <pic:nvPicPr>
+                    <pic:cNvPr id="0" name="logo-tec.png"/>
+                    <pic:cNvPicPr/>
+                  </pic:nvPicPr>
+                  <pic:blipFill>
+                    <a:blip r:embed="rId9"/>
+                    <a:stretch>
+                      <a:fillRect/>
+                    </a:stretch>
+                  </pic:blipFill>
+                  <pic:spPr>
+                    <a:xfrm>
+                      <a:off x="0" y="0"/>
+                      <a:ext cx="1463040" cy="1463040"/>
+                    </a:xfrm>
+                    <a:prstGeom prst="rect"/>
+                  </pic:spPr>
+                </pic:pic>
+              </a:graphicData>
+            </a:graphic>
+          </wp:inline>
+        </w:drawing>
+      </w:r>
+    </w:p>
+    <w:p>
+      <w:pPr>
+        <w:spacing w:after="480"/>
+        <w:jc w:val="center"/>
+      </w:pPr>
+    </w:p>
+    <w:p>
+      <w:pPr>
+        <w:spacing w:after="480"/>
+        <w:jc w:val="center"/>
+      </w:pPr>
+      <w:r>
+        <w:rPr>
+          <w:rFonts w:ascii="Times New Roman" w:hAnsi="Times New Roman"/>
+          <w:b/>
+          <w:sz w:val="28"/>
+        </w:rPr>
+        <w:t>Tarea 1: Pila, Cola y Tabla Hash</w:t>
+      </w:r>
+    </w:p>
+    <w:p>
+      <w:pPr>
+        <w:spacing w:after="120"/>
+        <w:jc w:val="center"/>
+      </w:pPr>
+      <w:r>
+        <w:rPr>
+          <w:rFonts w:ascii="Times New Roman" w:hAnsi="Times New Roman"/>
+          <w:b w:val="0"/>
+          <w:sz w:val="24"/>
+        </w:rPr>
+        <w:t>Hermann Pauwells Rivera</w:t>
+      </w:r>
+    </w:p>
+    <w:p>
+      <w:pPr>
+        <w:spacing w:after="120"/>
+        <w:jc w:val="center"/>
+      </w:pPr>
+      <w:r>
+        <w:rPr>
+          <w:rFonts w:ascii="Times New Roman" w:hAnsi="Times New Roman"/>
+          <w:b w:val="0"/>
+          <w:sz w:val="24"/>
+        </w:rPr>
+        <w:t>A01741456</w:t>
+      </w:r>
+    </w:p>
+    <w:p>
+      <w:pPr>
+        <w:spacing w:after="120"/>
+        <w:jc w:val="center"/>
+      </w:pPr>
+      <w:r>
+        <w:rPr>
+          <w:rFonts w:ascii="Times New Roman" w:hAnsi="Times New Roman"/>
+          <w:b w:val="0"/>
+          <w:sz w:val="24"/>
+        </w:rPr>
+        <w:t>Instituto Tecnológico y de Estudios Superiores de Monterrey, Campus Monterrey</w:t>
+      </w:r>
+    </w:p>
+    <w:p>
+      <w:pPr>
+        <w:spacing w:after="120"/>
+        <w:jc w:val="center"/>
+      </w:pPr>
+      <w:r>
+        <w:rPr>
+          <w:rFonts w:ascii="Times New Roman" w:hAnsi="Times New Roman"/>
+          <w:b w:val="0"/>
+          <w:sz w:val="24"/>
+        </w:rPr>
+        <w:t>Desarrollo de Aplicaciones Avanzadas de Ciencias Computacionales</w:t>
+      </w:r>
+    </w:p>
+    <w:p>
+      <w:pPr>
+        <w:spacing w:after="120"/>
+        <w:jc w:val="center"/>
+      </w:pPr>
+      <w:r>
+        <w:rPr>
+          <w:rFonts w:ascii="Times New Roman" w:hAnsi="Times New Roman"/>
+          <w:b w:val="0"/>
+          <w:sz w:val="24"/>
+        </w:rPr>
+        <w:t>Módulo 3: Compiladores</w:t>
+      </w:r>
+    </w:p>
+    <w:p>
+      <w:pPr>
+        <w:spacing w:after="120"/>
+        <w:jc w:val="center"/>
+      </w:pPr>
+      <w:r>
+        <w:rPr>
+          <w:rFonts w:ascii="Times New Roman" w:hAnsi="Times New Roman"/>
+          <w:b w:val="0"/>
+          <w:sz w:val="24"/>
+        </w:rPr>
+        <w:t>1 de octubre de 2026</w:t>
+      </w:r>
+    </w:p>
+    <w:p>
+      <w:pPr>
+        <w:spacing w:after="0"/>
+        <w:jc w:val="center"/>
+      </w:pPr>
+      <w:r>
+        <w:br w:type="page"/>
+      </w:r>
+    </w:p>
+    <w:p>
+      <w:pPr>
         <w:pStyle w:val="Title"/>
       </w:pPr>
       <w:r>
         <w:t>Tarea 1: Pila, Cola y Tabla Hash</w:t>
-      </w:r>
-    </w:p>
-    <w:p>
-      <w:r>
-        <w:t>Tecnológico de Monterrey - Desarrollo de Aplicaciones avanzadas de Ciencias Computacionales</w:t>
-      </w:r>
-    </w:p>
-    <w:p>
-      <w:r>
-        <w:t>Módulo 3: Compiladores</w:t>
-      </w:r>
-    </w:p>
-    <w:p>
-      <w:r>
-        <w:t>Nombre: Hermann Pauwells Rivera</w:t>
-      </w:r>
-    </w:p>
-    <w:p>
-      <w:r>
-        <w:t>Matrícula: A01741456</w:t>
-      </w:r>
-    </w:p>
-    <w:p>
-      <w:r>
-        <w:t>Fecha: 1 de octubre de 2026</w:t>
       </w:r>
     </w:p>
     <w:p>

</xml_diff>

<commit_message>
Entrega en formato APA 7
</commit_message>
<xml_diff>
--- a/Tarea1_A01741456.docx
+++ b/Tarea1_A01741456.docx
@@ -4,10 +4,15 @@
   <w:body>
     <w:p>
       <w:pPr>
-        <w:spacing w:after="0"/>
+        <w:spacing w:after="0" w:line="480" w:lineRule="auto" w:before="0"/>
         <w:jc w:val="center"/>
       </w:pPr>
       <w:r>
+        <w:rPr>
+          <w:rFonts w:ascii="Times New Roman" w:hAnsi="Times New Roman"/>
+          <w:color w:val="000000"/>
+          <w:sz w:val="24"/>
+        </w:rPr>
         <w:drawing>
           <wp:inline xmlns:a="http://schemas.openxmlformats.org/drawingml/2006/main" xmlns:pic="http://schemas.openxmlformats.org/drawingml/2006/picture">
             <wp:extent cx="1463040" cy="1463040"/>
@@ -44,33 +49,35 @@
     </w:p>
     <w:p>
       <w:pPr>
-        <w:spacing w:after="480"/>
+        <w:spacing w:after="0" w:line="480" w:lineRule="auto" w:before="0"/>
         <w:jc w:val="center"/>
       </w:pPr>
     </w:p>
     <w:p>
       <w:pPr>
-        <w:spacing w:after="480"/>
+        <w:spacing w:after="0" w:line="480" w:lineRule="auto" w:before="0"/>
         <w:jc w:val="center"/>
       </w:pPr>
       <w:r>
         <w:rPr>
           <w:rFonts w:ascii="Times New Roman" w:hAnsi="Times New Roman"/>
           <w:b/>
-          <w:sz w:val="28"/>
+          <w:color w:val="000000"/>
+          <w:sz w:val="24"/>
         </w:rPr>
         <w:t>Tarea 1: Pila, Cola y Tabla Hash</w:t>
       </w:r>
     </w:p>
     <w:p>
       <w:pPr>
-        <w:spacing w:after="120"/>
+        <w:spacing w:after="0" w:line="480" w:lineRule="auto" w:before="0"/>
         <w:jc w:val="center"/>
       </w:pPr>
       <w:r>
         <w:rPr>
           <w:rFonts w:ascii="Times New Roman" w:hAnsi="Times New Roman"/>
           <w:b w:val="0"/>
+          <w:color w:val="000000"/>
           <w:sz w:val="24"/>
         </w:rPr>
         <w:t>Hermann Pauwells Rivera</w:t>
@@ -78,13 +85,14 @@
     </w:p>
     <w:p>
       <w:pPr>
-        <w:spacing w:after="120"/>
+        <w:spacing w:after="0" w:line="480" w:lineRule="auto" w:before="0"/>
         <w:jc w:val="center"/>
       </w:pPr>
       <w:r>
         <w:rPr>
           <w:rFonts w:ascii="Times New Roman" w:hAnsi="Times New Roman"/>
           <w:b w:val="0"/>
+          <w:color w:val="000000"/>
           <w:sz w:val="24"/>
         </w:rPr>
         <w:t>A01741456</w:t>
@@ -92,13 +100,14 @@
     </w:p>
     <w:p>
       <w:pPr>
-        <w:spacing w:after="120"/>
+        <w:spacing w:after="0" w:line="480" w:lineRule="auto" w:before="0"/>
         <w:jc w:val="center"/>
       </w:pPr>
       <w:r>
         <w:rPr>
           <w:rFonts w:ascii="Times New Roman" w:hAnsi="Times New Roman"/>
           <w:b w:val="0"/>
+          <w:color w:val="000000"/>
           <w:sz w:val="24"/>
         </w:rPr>
         <w:t>Instituto Tecnológico y de Estudios Superiores de Monterrey, Campus Monterrey</w:t>
@@ -106,13 +115,14 @@
     </w:p>
     <w:p>
       <w:pPr>
-        <w:spacing w:after="120"/>
+        <w:spacing w:after="0" w:line="480" w:lineRule="auto" w:before="0"/>
         <w:jc w:val="center"/>
       </w:pPr>
       <w:r>
         <w:rPr>
           <w:rFonts w:ascii="Times New Roman" w:hAnsi="Times New Roman"/>
           <w:b w:val="0"/>
+          <w:color w:val="000000"/>
           <w:sz w:val="24"/>
         </w:rPr>
         <w:t>Desarrollo de Aplicaciones Avanzadas de Ciencias Computacionales</w:t>
@@ -120,13 +130,14 @@
     </w:p>
     <w:p>
       <w:pPr>
-        <w:spacing w:after="120"/>
+        <w:spacing w:after="0" w:line="480" w:lineRule="auto" w:before="0"/>
         <w:jc w:val="center"/>
       </w:pPr>
       <w:r>
         <w:rPr>
           <w:rFonts w:ascii="Times New Roman" w:hAnsi="Times New Roman"/>
           <w:b w:val="0"/>
+          <w:color w:val="000000"/>
           <w:sz w:val="24"/>
         </w:rPr>
         <w:t>Módulo 3: Compiladores</w:t>
@@ -134,13 +145,14 @@
     </w:p>
     <w:p>
       <w:pPr>
-        <w:spacing w:after="120"/>
+        <w:spacing w:after="0" w:line="480" w:lineRule="auto" w:before="0"/>
         <w:jc w:val="center"/>
       </w:pPr>
       <w:r>
         <w:rPr>
           <w:rFonts w:ascii="Times New Roman" w:hAnsi="Times New Roman"/>
           <w:b w:val="0"/>
+          <w:color w:val="000000"/>
           <w:sz w:val="24"/>
         </w:rPr>
         <w:t>1 de octubre de 2026</w:t>
@@ -148,144 +160,313 @@
     </w:p>
     <w:p>
       <w:pPr>
-        <w:spacing w:after="0"/>
+        <w:spacing w:after="0" w:line="480" w:lineRule="auto" w:before="0"/>
         <w:jc w:val="center"/>
       </w:pPr>
       <w:r>
+        <w:rPr>
+          <w:rFonts w:ascii="Times New Roman" w:hAnsi="Times New Roman"/>
+          <w:color w:val="000000"/>
+          <w:sz w:val="24"/>
+        </w:rPr>
         <w:br w:type="page"/>
       </w:r>
     </w:p>
     <w:p>
       <w:pPr>
-        <w:pStyle w:val="Title"/>
+        <w:spacing w:line="480" w:lineRule="auto" w:before="0" w:after="0"/>
+        <w:jc w:val="center"/>
       </w:pPr>
       <w:r>
+        <w:rPr>
+          <w:rFonts w:ascii="Times New Roman" w:hAnsi="Times New Roman"/>
+          <w:b/>
+          <w:color w:val="000000"/>
+          <w:sz w:val="24"/>
+        </w:rPr>
         <w:t>Tarea 1: Pila, Cola y Tabla Hash</w:t>
       </w:r>
     </w:p>
     <w:p>
+      <w:pPr>
+        <w:spacing w:line="480" w:lineRule="auto" w:before="0" w:after="0"/>
+        <w:jc w:val="left"/>
+      </w:pPr>
       <w:r>
+        <w:rPr>
+          <w:rFonts w:ascii="Times New Roman" w:hAnsi="Times New Roman"/>
+          <w:color w:val="000000"/>
+          <w:sz w:val="24"/>
+        </w:rPr>
         <w:t>Liga de Git: https://github.com/HermannPR/compiladores-ad26</w:t>
       </w:r>
     </w:p>
     <w:p>
       <w:pPr>
         <w:pStyle w:val="Heading1"/>
+        <w:spacing w:line="480" w:lineRule="auto" w:before="0" w:after="0"/>
+        <w:jc w:val="center"/>
       </w:pPr>
       <w:r>
+        <w:rPr>
+          <w:rFonts w:ascii="Times New Roman" w:hAnsi="Times New Roman"/>
+          <w:b/>
+          <w:i w:val="0"/>
+          <w:color w:val="000000"/>
+          <w:sz w:val="24"/>
+        </w:rPr>
         <w:t>Qué hice</w:t>
       </w:r>
     </w:p>
     <w:p>
+      <w:pPr>
+        <w:spacing w:line="480" w:lineRule="auto" w:before="0" w:after="0"/>
+        <w:ind w:firstLine="720"/>
+        <w:jc w:val="left"/>
+      </w:pPr>
       <w:r>
+        <w:rPr>
+          <w:rFonts w:ascii="Times New Roman" w:hAnsi="Times New Roman"/>
+          <w:color w:val="000000"/>
+          <w:sz w:val="24"/>
+        </w:rPr>
         <w:t>Implementé en Python 3, desde cero y sin librerías externas (solo la librería estándar), las tres estructuras que pide la tarea, cada una con sus operaciones clásicas de acceso y manipulación. Elegí Python porque es el lenguaje que planeo usar para el mini-proyecto.</w:t>
       </w:r>
     </w:p>
     <w:p>
       <w:pPr>
         <w:pStyle w:val="ListBullet"/>
+        <w:spacing w:line="480" w:lineRule="auto" w:before="0" w:after="0"/>
+        <w:jc w:val="left"/>
       </w:pPr>
       <w:r>
+        <w:rPr>
+          <w:rFonts w:ascii="Times New Roman" w:hAnsi="Times New Roman"/>
+          <w:color w:val="000000"/>
+          <w:sz w:val="24"/>
+        </w:rPr>
         <w:t>Pila (LIFO), estructuras/pila.py: usa una lista de Python donde el tope es el último elemento. Métodos: push, pop, peek, is_empty, size, clear, además de len, iteración (del tope al fondo) y repr. pop y peek sobre una pila vacía lanzan IndexError con un mensaje claro.</w:t>
       </w:r>
     </w:p>
     <w:p>
       <w:pPr>
         <w:pStyle w:val="ListBullet"/>
+        <w:spacing w:line="480" w:lineRule="auto" w:before="0" w:after="0"/>
+        <w:jc w:val="left"/>
       </w:pPr>
       <w:r>
+        <w:rPr>
+          <w:rFonts w:ascii="Times New Roman" w:hAnsi="Times New Roman"/>
+          <w:color w:val="000000"/>
+          <w:sz w:val="24"/>
+        </w:rPr>
         <w:t>Cola (FIFO), estructuras/cola.py: lista ligada simple con apuntadores al primero y al último nodo, así enqueue y dequeue son O(1). Métodos: enqueue, dequeue, front/peek, is_empty, size, clear, len, iteración y repr. dequeue y front sobre una cola vacía lanzan IndexError.</w:t>
       </w:r>
     </w:p>
     <w:p>
       <w:pPr>
         <w:pStyle w:val="ListBullet"/>
+        <w:spacing w:line="480" w:lineRule="auto" w:before="0" w:after="0"/>
+        <w:jc w:val="left"/>
       </w:pPr>
       <w:r>
+        <w:rPr>
+          <w:rFonts w:ascii="Times New Roman" w:hAnsi="Times New Roman"/>
+          <w:color w:val="000000"/>
+          <w:sz w:val="24"/>
+        </w:rPr>
         <w:t>Tabla hash / diccionario, estructuras/tabla.py: arreglo de cubetas con encadenamiento separado (cada cubeta es una lista de nodos). Cuando el factor de carga (elementos / cubetas) pasa de 0.75 se duplican las cubetas y se hace rehash de todos los nodos. Cada nodo también está en una lista doblemente ligada que guarda el orden de inserción, por eso keys, values e items e iteración regresan en ese orden y borrar es O(1) sobre ese orden. Sobrescribir una llave no cambia su posición; borrar y reinsertar la manda al final. Métodos: put/insert, get (con valor por defecto), remove/delete, contains, keys, values, items, size, clear, y los operadores [], []=, del, in, len, iteración y repr. El constructor acepta una función hash opcional para poder probar colisiones.</w:t>
       </w:r>
     </w:p>
     <w:p>
       <w:pPr>
         <w:pStyle w:val="ListBullet"/>
+        <w:spacing w:line="480" w:lineRule="auto" w:before="0" w:after="0"/>
+        <w:jc w:val="left"/>
       </w:pPr>
       <w:r>
+        <w:rPr>
+          <w:rFonts w:ascii="Times New Roman" w:hAnsi="Times New Roman"/>
+          <w:color w:val="000000"/>
+          <w:sz w:val="24"/>
+        </w:rPr>
         <w:t>demo.py: programa que usa las tres estructuras con ejemplos de compiladores: paréntesis balanceados con la pila, una cola de tokens a partir de la expresión x = 3 + y1 * (42 - z), y una tabla de símbolos (declarar variables con tipo y valor, buscar, actualizar y borrar).</w:t>
       </w:r>
     </w:p>
     <w:p>
       <w:pPr>
         <w:pStyle w:val="ListBullet"/>
+        <w:spacing w:line="480" w:lineRule="auto" w:before="0" w:after="0"/>
+        <w:jc w:val="left"/>
       </w:pPr>
       <w:r>
+        <w:rPr>
+          <w:rFonts w:ascii="Times New Roman" w:hAnsi="Times New Roman"/>
+          <w:color w:val="000000"/>
+          <w:sz w:val="24"/>
+        </w:rPr>
         <w:t>tests/test_estructuras.py: 46 pruebas con unittest.</w:t>
       </w:r>
     </w:p>
     <w:p>
       <w:pPr>
         <w:pStyle w:val="Heading1"/>
+        <w:spacing w:line="480" w:lineRule="auto" w:before="0" w:after="0"/>
+        <w:jc w:val="center"/>
       </w:pPr>
       <w:r>
+        <w:rPr>
+          <w:rFonts w:ascii="Times New Roman" w:hAnsi="Times New Roman"/>
+          <w:b/>
+          <w:i w:val="0"/>
+          <w:color w:val="000000"/>
+          <w:sz w:val="24"/>
+        </w:rPr>
         <w:t>Uso de IA</w:t>
       </w:r>
     </w:p>
     <w:p>
+      <w:pPr>
+        <w:spacing w:line="480" w:lineRule="auto" w:before="0" w:after="0"/>
+        <w:ind w:firstLine="720"/>
+        <w:jc w:val="left"/>
+      </w:pPr>
       <w:r>
+        <w:rPr>
+          <w:rFonts w:ascii="Times New Roman" w:hAnsi="Times New Roman"/>
+          <w:color w:val="000000"/>
+          <w:sz w:val="24"/>
+        </w:rPr>
         <w:t>Herramienta: Claude Code (Anthropic), como asistente de programación. Yo definí lo que necesitaba: las tres estructuras de la tarea en Python, que es el lenguaje que voy a usar en el mini-proyecto, implementadas desde cero y sin librerías, con un programa de demostración enfocado en compiladores (paréntesis balanceados, cola de tokens y tabla de símbolos), pruebas automáticas y comentarios sencillos en el código. Con esas instrucciones la herramienta generó una primera versión del código, de las pruebas y de este documento. Después revisé el código, ejecuté el demo y las 46 pruebas para comprobar cada operación, y lo subí a mi repositorio de Git.</w:t>
       </w:r>
     </w:p>
     <w:p>
       <w:pPr>
         <w:pStyle w:val="Heading2"/>
+        <w:spacing w:line="480" w:lineRule="auto" w:before="0" w:after="0"/>
+        <w:jc w:val="left"/>
       </w:pPr>
       <w:r>
+        <w:rPr>
+          <w:rFonts w:ascii="Times New Roman" w:hAnsi="Times New Roman"/>
+          <w:b/>
+          <w:i w:val="0"/>
+          <w:color w:val="000000"/>
+          <w:sz w:val="24"/>
+        </w:rPr>
         <w:t>Consultas (prompts)</w:t>
       </w:r>
     </w:p>
     <w:p>
+      <w:pPr>
+        <w:spacing w:line="480" w:lineRule="auto" w:before="0" w:after="0"/>
+        <w:ind w:firstLine="720"/>
+        <w:jc w:val="left"/>
+      </w:pPr>
       <w:r>
+        <w:rPr>
+          <w:rFonts w:ascii="Times New Roman" w:hAnsi="Times New Roman"/>
+          <w:color w:val="000000"/>
+          <w:sz w:val="24"/>
+        </w:rPr>
         <w:t>Consulta 1 (instrucción de Hermann):</w:t>
       </w:r>
     </w:p>
     <w:p>
       <w:pPr>
         <w:pStyle w:val="Quote"/>
+        <w:spacing w:line="480" w:lineRule="auto" w:before="0" w:after="0"/>
+        <w:ind w:left="720" w:firstLine="0"/>
+        <w:jc w:val="left"/>
       </w:pPr>
       <w:r>
+        <w:rPr>
+          <w:rFonts w:ascii="Times New Roman" w:hAnsi="Times New Roman"/>
+          <w:i w:val="0"/>
+          <w:color w:val="000000"/>
+          <w:sz w:val="24"/>
+        </w:rPr>
         <w:t>"asignen a un subagente a hacer la siguiente tarea. notas antes de pegar las instrucciones: tenemos que poner comentario asi como si lo hubiera hecho yo por ejemplo pila 1 e incluir metodos o lo que lo componga asi escrito como comentario si yo lo hubiera hecho, normalito. adelante"</w:t>
       </w:r>
     </w:p>
     <w:p>
       <w:pPr>
         <w:pStyle w:val="Quote"/>
+        <w:spacing w:line="480" w:lineRule="auto" w:before="0" w:after="0"/>
+        <w:ind w:left="720" w:firstLine="0"/>
+        <w:jc w:val="left"/>
       </w:pPr>
       <w:r>
+        <w:rPr>
+          <w:rFonts w:ascii="Times New Roman" w:hAnsi="Times New Roman"/>
+          <w:i w:val="0"/>
+          <w:color w:val="000000"/>
+          <w:sz w:val="24"/>
+        </w:rPr>
         <w:t>[instrucciones de Canvas y el PDF Tar#1 ad26.pdf]</w:t>
       </w:r>
     </w:p>
     <w:p>
+      <w:pPr>
+        <w:spacing w:line="480" w:lineRule="auto" w:before="0" w:after="0"/>
+        <w:ind w:firstLine="720"/>
+        <w:jc w:val="left"/>
+      </w:pPr>
       <w:r>
+        <w:rPr>
+          <w:rFonts w:ascii="Times New Roman" w:hAnsi="Times New Roman"/>
+          <w:color w:val="000000"/>
+          <w:sz w:val="24"/>
+        </w:rPr>
         <w:t>Consulta 2 (resumen de la instrucción dada al subagente):</w:t>
       </w:r>
     </w:p>
     <w:p>
       <w:pPr>
         <w:pStyle w:val="Quote"/>
+        <w:spacing w:line="480" w:lineRule="auto" w:before="0" w:after="0"/>
+        <w:ind w:left="720" w:firstLine="0"/>
+        <w:jc w:val="left"/>
       </w:pPr>
       <w:r>
+        <w:rPr>
+          <w:rFonts w:ascii="Times New Roman" w:hAnsi="Times New Roman"/>
+          <w:i w:val="0"/>
+          <w:color w:val="000000"/>
+          <w:sz w:val="24"/>
+        </w:rPr>
         <w:t>"Implementar en Python desde cero Pila, Cola y TablaHash con sus operaciones clásicas, un programa demo con ejemplos de compiladores (paréntesis balanceados, cola de tokens, tabla de símbolos), pruebas con unittest y el documento de entrega"</w:t>
       </w:r>
     </w:p>
     <w:p>
       <w:pPr>
         <w:pStyle w:val="Heading1"/>
+        <w:spacing w:line="480" w:lineRule="auto" w:before="0" w:after="0"/>
+        <w:jc w:val="center"/>
       </w:pPr>
       <w:r>
+        <w:rPr>
+          <w:rFonts w:ascii="Times New Roman" w:hAnsi="Times New Roman"/>
+          <w:b/>
+          <w:i w:val="0"/>
+          <w:color w:val="000000"/>
+          <w:sz w:val="24"/>
+        </w:rPr>
         <w:t>Test cases</w:t>
       </w:r>
     </w:p>
     <w:p>
+      <w:pPr>
+        <w:spacing w:line="480" w:lineRule="auto" w:before="0" w:after="0"/>
+        <w:ind w:firstLine="720"/>
+        <w:jc w:val="left"/>
+      </w:pPr>
       <w:r>
+        <w:rPr>
+          <w:rFonts w:ascii="Times New Roman" w:hAnsi="Times New Roman"/>
+          <w:color w:val="000000"/>
+          <w:sz w:val="24"/>
+        </w:rPr>
         <w:t>Las pruebas están en tests/test_estructuras.py (unittest). Son 46 en total y todas pasan. Cubren casos normales, casos límite (estructura vacía, un solo elemento, muchos elementos), colisiones, redimensionado, sobrescritura, borrar y reinsertar, y orden de inserción.</w:t>
       </w:r>
     </w:p>
@@ -308,10 +489,15 @@
             <w:tcW w:type="dxa" w:w="1728"/>
           </w:tcPr>
           <w:p>
+            <w:pPr>
+              <w:spacing w:line="240" w:lineRule="auto"/>
+            </w:pPr>
             <w:r>
               <w:rPr>
+                <w:rFonts w:ascii="Times New Roman" w:hAnsi="Times New Roman"/>
                 <w:b/>
-                <w:sz w:val="18"/>
+                <w:color w:val="000000"/>
+                <w:sz w:val="22"/>
               </w:rPr>
               <w:t>Estructura</w:t>
             </w:r>
@@ -322,10 +508,15 @@
             <w:tcW w:type="dxa" w:w="1728"/>
           </w:tcPr>
           <w:p>
+            <w:pPr>
+              <w:spacing w:line="240" w:lineRule="auto"/>
+            </w:pPr>
             <w:r>
               <w:rPr>
+                <w:rFonts w:ascii="Times New Roman" w:hAnsi="Times New Roman"/>
                 <w:b/>
-                <w:sz w:val="18"/>
+                <w:color w:val="000000"/>
+                <w:sz w:val="22"/>
               </w:rPr>
               <w:t>Caso (test)</w:t>
             </w:r>
@@ -336,10 +527,15 @@
             <w:tcW w:type="dxa" w:w="1728"/>
           </w:tcPr>
           <w:p>
+            <w:pPr>
+              <w:spacing w:line="240" w:lineRule="auto"/>
+            </w:pPr>
             <w:r>
               <w:rPr>
+                <w:rFonts w:ascii="Times New Roman" w:hAnsi="Times New Roman"/>
                 <w:b/>
-                <w:sz w:val="18"/>
+                <w:color w:val="000000"/>
+                <w:sz w:val="22"/>
               </w:rPr>
               <w:t>Entrada / acción</w:t>
             </w:r>
@@ -350,10 +546,15 @@
             <w:tcW w:type="dxa" w:w="1728"/>
           </w:tcPr>
           <w:p>
+            <w:pPr>
+              <w:spacing w:line="240" w:lineRule="auto"/>
+            </w:pPr>
             <w:r>
               <w:rPr>
+                <w:rFonts w:ascii="Times New Roman" w:hAnsi="Times New Roman"/>
                 <w:b/>
-                <w:sz w:val="18"/>
+                <w:color w:val="000000"/>
+                <w:sz w:val="22"/>
               </w:rPr>
               <w:t>Resultado esperado</w:t>
             </w:r>
@@ -364,10 +565,15 @@
             <w:tcW w:type="dxa" w:w="1728"/>
           </w:tcPr>
           <w:p>
+            <w:pPr>
+              <w:spacing w:line="240" w:lineRule="auto"/>
+            </w:pPr>
             <w:r>
               <w:rPr>
+                <w:rFonts w:ascii="Times New Roman" w:hAnsi="Times New Roman"/>
                 <w:b/>
-                <w:sz w:val="18"/>
+                <w:color w:val="000000"/>
+                <w:sz w:val="22"/>
               </w:rPr>
               <w:t>Resultado</w:t>
             </w:r>
@@ -380,9 +586,14 @@
             <w:tcW w:type="dxa" w:w="1728"/>
           </w:tcPr>
           <w:p>
+            <w:pPr>
+              <w:spacing w:line="240" w:lineRule="auto"/>
+            </w:pPr>
             <w:r>
               <w:rPr>
-                <w:sz w:val="18"/>
+                <w:rFonts w:ascii="Times New Roman" w:hAnsi="Times New Roman"/>
+                <w:color w:val="000000"/>
+                <w:sz w:val="22"/>
               </w:rPr>
               <w:t>Pila</w:t>
             </w:r>
@@ -393,9 +604,14 @@
             <w:tcW w:type="dxa" w:w="1728"/>
           </w:tcPr>
           <w:p>
+            <w:pPr>
+              <w:spacing w:line="240" w:lineRule="auto"/>
+            </w:pPr>
             <w:r>
               <w:rPr>
-                <w:sz w:val="18"/>
+                <w:rFonts w:ascii="Times New Roman" w:hAnsi="Times New Roman"/>
+                <w:color w:val="000000"/>
+                <w:sz w:val="22"/>
               </w:rPr>
               <w:t>test_pila_nueva_esta_vacia</w:t>
             </w:r>
@@ -406,9 +622,14 @@
             <w:tcW w:type="dxa" w:w="1728"/>
           </w:tcPr>
           <w:p>
+            <w:pPr>
+              <w:spacing w:line="240" w:lineRule="auto"/>
+            </w:pPr>
             <w:r>
               <w:rPr>
-                <w:sz w:val="18"/>
+                <w:rFonts w:ascii="Times New Roman" w:hAnsi="Times New Roman"/>
+                <w:color w:val="000000"/>
+                <w:sz w:val="22"/>
               </w:rPr>
               <w:t>Pila()</w:t>
             </w:r>
@@ -419,9 +640,14 @@
             <w:tcW w:type="dxa" w:w="1728"/>
           </w:tcPr>
           <w:p>
+            <w:pPr>
+              <w:spacing w:line="240" w:lineRule="auto"/>
+            </w:pPr>
             <w:r>
               <w:rPr>
-                <w:sz w:val="18"/>
+                <w:rFonts w:ascii="Times New Roman" w:hAnsi="Times New Roman"/>
+                <w:color w:val="000000"/>
+                <w:sz w:val="22"/>
               </w:rPr>
               <w:t>is_empty() es True y size() es 0</w:t>
             </w:r>
@@ -432,9 +658,14 @@
             <w:tcW w:type="dxa" w:w="1728"/>
           </w:tcPr>
           <w:p>
+            <w:pPr>
+              <w:spacing w:line="240" w:lineRule="auto"/>
+            </w:pPr>
             <w:r>
               <w:rPr>
-                <w:sz w:val="18"/>
+                <w:rFonts w:ascii="Times New Roman" w:hAnsi="Times New Roman"/>
+                <w:color w:val="000000"/>
+                <w:sz w:val="22"/>
               </w:rPr>
               <w:t>OK</w:t>
             </w:r>
@@ -447,9 +678,14 @@
             <w:tcW w:type="dxa" w:w="1728"/>
           </w:tcPr>
           <w:p>
+            <w:pPr>
+              <w:spacing w:line="240" w:lineRule="auto"/>
+            </w:pPr>
             <w:r>
               <w:rPr>
-                <w:sz w:val="18"/>
+                <w:rFonts w:ascii="Times New Roman" w:hAnsi="Times New Roman"/>
+                <w:color w:val="000000"/>
+                <w:sz w:val="22"/>
               </w:rPr>
               <w:t>Pila</w:t>
             </w:r>
@@ -460,9 +696,14 @@
             <w:tcW w:type="dxa" w:w="1728"/>
           </w:tcPr>
           <w:p>
+            <w:pPr>
+              <w:spacing w:line="240" w:lineRule="auto"/>
+            </w:pPr>
             <w:r>
               <w:rPr>
-                <w:sz w:val="18"/>
+                <w:rFonts w:ascii="Times New Roman" w:hAnsi="Times New Roman"/>
+                <w:color w:val="000000"/>
+                <w:sz w:val="22"/>
               </w:rPr>
               <w:t>test_push_y_pop_lifo</w:t>
             </w:r>
@@ -473,9 +714,14 @@
             <w:tcW w:type="dxa" w:w="1728"/>
           </w:tcPr>
           <w:p>
+            <w:pPr>
+              <w:spacing w:line="240" w:lineRule="auto"/>
+            </w:pPr>
             <w:r>
               <w:rPr>
-                <w:sz w:val="18"/>
+                <w:rFonts w:ascii="Times New Roman" w:hAnsi="Times New Roman"/>
+                <w:color w:val="000000"/>
+                <w:sz w:val="22"/>
               </w:rPr>
               <w:t>push 1, 2, 3 y tres pop</w:t>
             </w:r>
@@ -486,9 +732,14 @@
             <w:tcW w:type="dxa" w:w="1728"/>
           </w:tcPr>
           <w:p>
+            <w:pPr>
+              <w:spacing w:line="240" w:lineRule="auto"/>
+            </w:pPr>
             <w:r>
               <w:rPr>
-                <w:sz w:val="18"/>
+                <w:rFonts w:ascii="Times New Roman" w:hAnsi="Times New Roman"/>
+                <w:color w:val="000000"/>
+                <w:sz w:val="22"/>
               </w:rPr>
               <w:t>salen 3, 2, 1</w:t>
             </w:r>
@@ -499,9 +750,14 @@
             <w:tcW w:type="dxa" w:w="1728"/>
           </w:tcPr>
           <w:p>
+            <w:pPr>
+              <w:spacing w:line="240" w:lineRule="auto"/>
+            </w:pPr>
             <w:r>
               <w:rPr>
-                <w:sz w:val="18"/>
+                <w:rFonts w:ascii="Times New Roman" w:hAnsi="Times New Roman"/>
+                <w:color w:val="000000"/>
+                <w:sz w:val="22"/>
               </w:rPr>
               <w:t>OK</w:t>
             </w:r>
@@ -514,9 +770,14 @@
             <w:tcW w:type="dxa" w:w="1728"/>
           </w:tcPr>
           <w:p>
+            <w:pPr>
+              <w:spacing w:line="240" w:lineRule="auto"/>
+            </w:pPr>
             <w:r>
               <w:rPr>
-                <w:sz w:val="18"/>
+                <w:rFonts w:ascii="Times New Roman" w:hAnsi="Times New Roman"/>
+                <w:color w:val="000000"/>
+                <w:sz w:val="22"/>
               </w:rPr>
               <w:t>Pila</w:t>
             </w:r>
@@ -527,9 +788,14 @@
             <w:tcW w:type="dxa" w:w="1728"/>
           </w:tcPr>
           <w:p>
+            <w:pPr>
+              <w:spacing w:line="240" w:lineRule="auto"/>
+            </w:pPr>
             <w:r>
               <w:rPr>
-                <w:sz w:val="18"/>
+                <w:rFonts w:ascii="Times New Roman" w:hAnsi="Times New Roman"/>
+                <w:color w:val="000000"/>
+                <w:sz w:val="22"/>
               </w:rPr>
               <w:t>test_peek_no_saca</w:t>
             </w:r>
@@ -540,9 +806,14 @@
             <w:tcW w:type="dxa" w:w="1728"/>
           </w:tcPr>
           <w:p>
+            <w:pPr>
+              <w:spacing w:line="240" w:lineRule="auto"/>
+            </w:pPr>
             <w:r>
               <w:rPr>
-                <w:sz w:val="18"/>
+                <w:rFonts w:ascii="Times New Roman" w:hAnsi="Times New Roman"/>
+                <w:color w:val="000000"/>
+                <w:sz w:val="22"/>
               </w:rPr>
               <w:t>push a, b y peek</w:t>
             </w:r>
@@ -553,9 +824,14 @@
             <w:tcW w:type="dxa" w:w="1728"/>
           </w:tcPr>
           <w:p>
+            <w:pPr>
+              <w:spacing w:line="240" w:lineRule="auto"/>
+            </w:pPr>
             <w:r>
               <w:rPr>
-                <w:sz w:val="18"/>
+                <w:rFonts w:ascii="Times New Roman" w:hAnsi="Times New Roman"/>
+                <w:color w:val="000000"/>
+                <w:sz w:val="22"/>
               </w:rPr>
               <w:t>regresa b y size sigue en 2</w:t>
             </w:r>
@@ -566,9 +842,14 @@
             <w:tcW w:type="dxa" w:w="1728"/>
           </w:tcPr>
           <w:p>
+            <w:pPr>
+              <w:spacing w:line="240" w:lineRule="auto"/>
+            </w:pPr>
             <w:r>
               <w:rPr>
-                <w:sz w:val="18"/>
+                <w:rFonts w:ascii="Times New Roman" w:hAnsi="Times New Roman"/>
+                <w:color w:val="000000"/>
+                <w:sz w:val="22"/>
               </w:rPr>
               <w:t>OK</w:t>
             </w:r>
@@ -581,9 +862,14 @@
             <w:tcW w:type="dxa" w:w="1728"/>
           </w:tcPr>
           <w:p>
+            <w:pPr>
+              <w:spacing w:line="240" w:lineRule="auto"/>
+            </w:pPr>
             <w:r>
               <w:rPr>
-                <w:sz w:val="18"/>
+                <w:rFonts w:ascii="Times New Roman" w:hAnsi="Times New Roman"/>
+                <w:color w:val="000000"/>
+                <w:sz w:val="22"/>
               </w:rPr>
               <w:t>Pila</w:t>
             </w:r>
@@ -594,9 +880,14 @@
             <w:tcW w:type="dxa" w:w="1728"/>
           </w:tcPr>
           <w:p>
+            <w:pPr>
+              <w:spacing w:line="240" w:lineRule="auto"/>
+            </w:pPr>
             <w:r>
               <w:rPr>
-                <w:sz w:val="18"/>
+                <w:rFonts w:ascii="Times New Roman" w:hAnsi="Times New Roman"/>
+                <w:color w:val="000000"/>
+                <w:sz w:val="22"/>
               </w:rPr>
               <w:t>test_pop_pila_vacia</w:t>
             </w:r>
@@ -607,9 +898,14 @@
             <w:tcW w:type="dxa" w:w="1728"/>
           </w:tcPr>
           <w:p>
+            <w:pPr>
+              <w:spacing w:line="240" w:lineRule="auto"/>
+            </w:pPr>
             <w:r>
               <w:rPr>
-                <w:sz w:val="18"/>
+                <w:rFonts w:ascii="Times New Roman" w:hAnsi="Times New Roman"/>
+                <w:color w:val="000000"/>
+                <w:sz w:val="22"/>
               </w:rPr>
               <w:t>pop sobre pila vacia</w:t>
             </w:r>
@@ -620,9 +916,14 @@
             <w:tcW w:type="dxa" w:w="1728"/>
           </w:tcPr>
           <w:p>
+            <w:pPr>
+              <w:spacing w:line="240" w:lineRule="auto"/>
+            </w:pPr>
             <w:r>
               <w:rPr>
-                <w:sz w:val="18"/>
+                <w:rFonts w:ascii="Times New Roman" w:hAnsi="Times New Roman"/>
+                <w:color w:val="000000"/>
+                <w:sz w:val="22"/>
               </w:rPr>
               <w:t>IndexError</w:t>
             </w:r>
@@ -633,9 +934,14 @@
             <w:tcW w:type="dxa" w:w="1728"/>
           </w:tcPr>
           <w:p>
+            <w:pPr>
+              <w:spacing w:line="240" w:lineRule="auto"/>
+            </w:pPr>
             <w:r>
               <w:rPr>
-                <w:sz w:val="18"/>
+                <w:rFonts w:ascii="Times New Roman" w:hAnsi="Times New Roman"/>
+                <w:color w:val="000000"/>
+                <w:sz w:val="22"/>
               </w:rPr>
               <w:t>OK</w:t>
             </w:r>
@@ -648,9 +954,14 @@
             <w:tcW w:type="dxa" w:w="1728"/>
           </w:tcPr>
           <w:p>
+            <w:pPr>
+              <w:spacing w:line="240" w:lineRule="auto"/>
+            </w:pPr>
             <w:r>
               <w:rPr>
-                <w:sz w:val="18"/>
+                <w:rFonts w:ascii="Times New Roman" w:hAnsi="Times New Roman"/>
+                <w:color w:val="000000"/>
+                <w:sz w:val="22"/>
               </w:rPr>
               <w:t>Pila</w:t>
             </w:r>
@@ -661,9 +972,14 @@
             <w:tcW w:type="dxa" w:w="1728"/>
           </w:tcPr>
           <w:p>
+            <w:pPr>
+              <w:spacing w:line="240" w:lineRule="auto"/>
+            </w:pPr>
             <w:r>
               <w:rPr>
-                <w:sz w:val="18"/>
+                <w:rFonts w:ascii="Times New Roman" w:hAnsi="Times New Roman"/>
+                <w:color w:val="000000"/>
+                <w:sz w:val="22"/>
               </w:rPr>
               <w:t>test_peek_pila_vacia</w:t>
             </w:r>
@@ -674,9 +990,14 @@
             <w:tcW w:type="dxa" w:w="1728"/>
           </w:tcPr>
           <w:p>
+            <w:pPr>
+              <w:spacing w:line="240" w:lineRule="auto"/>
+            </w:pPr>
             <w:r>
               <w:rPr>
-                <w:sz w:val="18"/>
+                <w:rFonts w:ascii="Times New Roman" w:hAnsi="Times New Roman"/>
+                <w:color w:val="000000"/>
+                <w:sz w:val="22"/>
               </w:rPr>
               <w:t>peek sobre pila vacia</w:t>
             </w:r>
@@ -687,9 +1008,14 @@
             <w:tcW w:type="dxa" w:w="1728"/>
           </w:tcPr>
           <w:p>
+            <w:pPr>
+              <w:spacing w:line="240" w:lineRule="auto"/>
+            </w:pPr>
             <w:r>
               <w:rPr>
-                <w:sz w:val="18"/>
+                <w:rFonts w:ascii="Times New Roman" w:hAnsi="Times New Roman"/>
+                <w:color w:val="000000"/>
+                <w:sz w:val="22"/>
               </w:rPr>
               <w:t>IndexError</w:t>
             </w:r>
@@ -700,9 +1026,14 @@
             <w:tcW w:type="dxa" w:w="1728"/>
           </w:tcPr>
           <w:p>
+            <w:pPr>
+              <w:spacing w:line="240" w:lineRule="auto"/>
+            </w:pPr>
             <w:r>
               <w:rPr>
-                <w:sz w:val="18"/>
+                <w:rFonts w:ascii="Times New Roman" w:hAnsi="Times New Roman"/>
+                <w:color w:val="000000"/>
+                <w:sz w:val="22"/>
               </w:rPr>
               <w:t>OK</w:t>
             </w:r>
@@ -715,9 +1046,14 @@
             <w:tcW w:type="dxa" w:w="1728"/>
           </w:tcPr>
           <w:p>
+            <w:pPr>
+              <w:spacing w:line="240" w:lineRule="auto"/>
+            </w:pPr>
             <w:r>
               <w:rPr>
-                <w:sz w:val="18"/>
+                <w:rFonts w:ascii="Times New Roman" w:hAnsi="Times New Roman"/>
+                <w:color w:val="000000"/>
+                <w:sz w:val="22"/>
               </w:rPr>
               <w:t>Pila</w:t>
             </w:r>
@@ -728,9 +1064,14 @@
             <w:tcW w:type="dxa" w:w="1728"/>
           </w:tcPr>
           <w:p>
+            <w:pPr>
+              <w:spacing w:line="240" w:lineRule="auto"/>
+            </w:pPr>
             <w:r>
               <w:rPr>
-                <w:sz w:val="18"/>
+                <w:rFonts w:ascii="Times New Roman" w:hAnsi="Times New Roman"/>
+                <w:color w:val="000000"/>
+                <w:sz w:val="22"/>
               </w:rPr>
               <w:t>test_un_solo_elemento</w:t>
             </w:r>
@@ -741,9 +1082,14 @@
             <w:tcW w:type="dxa" w:w="1728"/>
           </w:tcPr>
           <w:p>
+            <w:pPr>
+              <w:spacing w:line="240" w:lineRule="auto"/>
+            </w:pPr>
             <w:r>
               <w:rPr>
-                <w:sz w:val="18"/>
+                <w:rFonts w:ascii="Times New Roman" w:hAnsi="Times New Roman"/>
+                <w:color w:val="000000"/>
+                <w:sz w:val="22"/>
               </w:rPr>
               <w:t>push 7 y pop</w:t>
             </w:r>
@@ -754,9 +1100,14 @@
             <w:tcW w:type="dxa" w:w="1728"/>
           </w:tcPr>
           <w:p>
+            <w:pPr>
+              <w:spacing w:line="240" w:lineRule="auto"/>
+            </w:pPr>
             <w:r>
               <w:rPr>
-                <w:sz w:val="18"/>
+                <w:rFonts w:ascii="Times New Roman" w:hAnsi="Times New Roman"/>
+                <w:color w:val="000000"/>
+                <w:sz w:val="22"/>
               </w:rPr>
               <w:t>regresa 7 y queda vacia</w:t>
             </w:r>
@@ -767,9 +1118,14 @@
             <w:tcW w:type="dxa" w:w="1728"/>
           </w:tcPr>
           <w:p>
+            <w:pPr>
+              <w:spacing w:line="240" w:lineRule="auto"/>
+            </w:pPr>
             <w:r>
               <w:rPr>
-                <w:sz w:val="18"/>
+                <w:rFonts w:ascii="Times New Roman" w:hAnsi="Times New Roman"/>
+                <w:color w:val="000000"/>
+                <w:sz w:val="22"/>
               </w:rPr>
               <w:t>OK</w:t>
             </w:r>
@@ -782,9 +1138,14 @@
             <w:tcW w:type="dxa" w:w="1728"/>
           </w:tcPr>
           <w:p>
+            <w:pPr>
+              <w:spacing w:line="240" w:lineRule="auto"/>
+            </w:pPr>
             <w:r>
               <w:rPr>
-                <w:sz w:val="18"/>
+                <w:rFonts w:ascii="Times New Roman" w:hAnsi="Times New Roman"/>
+                <w:color w:val="000000"/>
+                <w:sz w:val="22"/>
               </w:rPr>
               <w:t>Pila</w:t>
             </w:r>
@@ -795,9 +1156,14 @@
             <w:tcW w:type="dxa" w:w="1728"/>
           </w:tcPr>
           <w:p>
+            <w:pPr>
+              <w:spacing w:line="240" w:lineRule="auto"/>
+            </w:pPr>
             <w:r>
               <w:rPr>
-                <w:sz w:val="18"/>
+                <w:rFonts w:ascii="Times New Roman" w:hAnsi="Times New Roman"/>
+                <w:color w:val="000000"/>
+                <w:sz w:val="22"/>
               </w:rPr>
               <w:t>test_clear</w:t>
             </w:r>
@@ -808,9 +1174,14 @@
             <w:tcW w:type="dxa" w:w="1728"/>
           </w:tcPr>
           <w:p>
+            <w:pPr>
+              <w:spacing w:line="240" w:lineRule="auto"/>
+            </w:pPr>
             <w:r>
               <w:rPr>
-                <w:sz w:val="18"/>
+                <w:rFonts w:ascii="Times New Roman" w:hAnsi="Times New Roman"/>
+                <w:color w:val="000000"/>
+                <w:sz w:val="22"/>
               </w:rPr>
               <w:t>push 1, 2 y clear</w:t>
             </w:r>
@@ -821,9 +1192,14 @@
             <w:tcW w:type="dxa" w:w="1728"/>
           </w:tcPr>
           <w:p>
+            <w:pPr>
+              <w:spacing w:line="240" w:lineRule="auto"/>
+            </w:pPr>
             <w:r>
               <w:rPr>
-                <w:sz w:val="18"/>
+                <w:rFonts w:ascii="Times New Roman" w:hAnsi="Times New Roman"/>
+                <w:color w:val="000000"/>
+                <w:sz w:val="22"/>
               </w:rPr>
               <w:t>queda vacia, len 0</w:t>
             </w:r>
@@ -834,9 +1210,14 @@
             <w:tcW w:type="dxa" w:w="1728"/>
           </w:tcPr>
           <w:p>
+            <w:pPr>
+              <w:spacing w:line="240" w:lineRule="auto"/>
+            </w:pPr>
             <w:r>
               <w:rPr>
-                <w:sz w:val="18"/>
+                <w:rFonts w:ascii="Times New Roman" w:hAnsi="Times New Roman"/>
+                <w:color w:val="000000"/>
+                <w:sz w:val="22"/>
               </w:rPr>
               <w:t>OK</w:t>
             </w:r>
@@ -849,9 +1230,14 @@
             <w:tcW w:type="dxa" w:w="1728"/>
           </w:tcPr>
           <w:p>
+            <w:pPr>
+              <w:spacing w:line="240" w:lineRule="auto"/>
+            </w:pPr>
             <w:r>
               <w:rPr>
-                <w:sz w:val="18"/>
+                <w:rFonts w:ascii="Times New Roman" w:hAnsi="Times New Roman"/>
+                <w:color w:val="000000"/>
+                <w:sz w:val="22"/>
               </w:rPr>
               <w:t>Pila</w:t>
             </w:r>
@@ -862,9 +1248,14 @@
             <w:tcW w:type="dxa" w:w="1728"/>
           </w:tcPr>
           <w:p>
+            <w:pPr>
+              <w:spacing w:line="240" w:lineRule="auto"/>
+            </w:pPr>
             <w:r>
               <w:rPr>
-                <w:sz w:val="18"/>
+                <w:rFonts w:ascii="Times New Roman" w:hAnsi="Times New Roman"/>
+                <w:color w:val="000000"/>
+                <w:sz w:val="22"/>
               </w:rPr>
               <w:t>test_muchos_elementos</w:t>
             </w:r>
@@ -875,9 +1266,14 @@
             <w:tcW w:type="dxa" w:w="1728"/>
           </w:tcPr>
           <w:p>
+            <w:pPr>
+              <w:spacing w:line="240" w:lineRule="auto"/>
+            </w:pPr>
             <w:r>
               <w:rPr>
-                <w:sz w:val="18"/>
+                <w:rFonts w:ascii="Times New Roman" w:hAnsi="Times New Roman"/>
+                <w:color w:val="000000"/>
+                <w:sz w:val="22"/>
               </w:rPr>
               <w:t>10000 push, pop y peek</w:t>
             </w:r>
@@ -888,9 +1284,14 @@
             <w:tcW w:type="dxa" w:w="1728"/>
           </w:tcPr>
           <w:p>
+            <w:pPr>
+              <w:spacing w:line="240" w:lineRule="auto"/>
+            </w:pPr>
             <w:r>
               <w:rPr>
-                <w:sz w:val="18"/>
+                <w:rFonts w:ascii="Times New Roman" w:hAnsi="Times New Roman"/>
+                <w:color w:val="000000"/>
+                <w:sz w:val="22"/>
               </w:rPr>
               <w:t>len 10000, pop 9999, peek 9998</w:t>
             </w:r>
@@ -901,9 +1302,14 @@
             <w:tcW w:type="dxa" w:w="1728"/>
           </w:tcPr>
           <w:p>
+            <w:pPr>
+              <w:spacing w:line="240" w:lineRule="auto"/>
+            </w:pPr>
             <w:r>
               <w:rPr>
-                <w:sz w:val="18"/>
+                <w:rFonts w:ascii="Times New Roman" w:hAnsi="Times New Roman"/>
+                <w:color w:val="000000"/>
+                <w:sz w:val="22"/>
               </w:rPr>
               <w:t>OK</w:t>
             </w:r>
@@ -916,9 +1322,14 @@
             <w:tcW w:type="dxa" w:w="1728"/>
           </w:tcPr>
           <w:p>
+            <w:pPr>
+              <w:spacing w:line="240" w:lineRule="auto"/>
+            </w:pPr>
             <w:r>
               <w:rPr>
-                <w:sz w:val="18"/>
+                <w:rFonts w:ascii="Times New Roman" w:hAnsi="Times New Roman"/>
+                <w:color w:val="000000"/>
+                <w:sz w:val="22"/>
               </w:rPr>
               <w:t>Pila</w:t>
             </w:r>
@@ -929,9 +1340,14 @@
             <w:tcW w:type="dxa" w:w="1728"/>
           </w:tcPr>
           <w:p>
+            <w:pPr>
+              <w:spacing w:line="240" w:lineRule="auto"/>
+            </w:pPr>
             <w:r>
               <w:rPr>
-                <w:sz w:val="18"/>
+                <w:rFonts w:ascii="Times New Roman" w:hAnsi="Times New Roman"/>
+                <w:color w:val="000000"/>
+                <w:sz w:val="22"/>
               </w:rPr>
               <w:t>test_iteracion_tope_a_fondo</w:t>
             </w:r>
@@ -942,9 +1358,14 @@
             <w:tcW w:type="dxa" w:w="1728"/>
           </w:tcPr>
           <w:p>
+            <w:pPr>
+              <w:spacing w:line="240" w:lineRule="auto"/>
+            </w:pPr>
             <w:r>
               <w:rPr>
-                <w:sz w:val="18"/>
+                <w:rFonts w:ascii="Times New Roman" w:hAnsi="Times New Roman"/>
+                <w:color w:val="000000"/>
+                <w:sz w:val="22"/>
               </w:rPr>
               <w:t>push 1, 2, 3 y list(pila)</w:t>
             </w:r>
@@ -955,9 +1376,14 @@
             <w:tcW w:type="dxa" w:w="1728"/>
           </w:tcPr>
           <w:p>
+            <w:pPr>
+              <w:spacing w:line="240" w:lineRule="auto"/>
+            </w:pPr>
             <w:r>
               <w:rPr>
-                <w:sz w:val="18"/>
+                <w:rFonts w:ascii="Times New Roman" w:hAnsi="Times New Roman"/>
+                <w:color w:val="000000"/>
+                <w:sz w:val="22"/>
               </w:rPr>
               <w:t>[3, 2, 1]</w:t>
             </w:r>
@@ -968,9 +1394,14 @@
             <w:tcW w:type="dxa" w:w="1728"/>
           </w:tcPr>
           <w:p>
+            <w:pPr>
+              <w:spacing w:line="240" w:lineRule="auto"/>
+            </w:pPr>
             <w:r>
               <w:rPr>
-                <w:sz w:val="18"/>
+                <w:rFonts w:ascii="Times New Roman" w:hAnsi="Times New Roman"/>
+                <w:color w:val="000000"/>
+                <w:sz w:val="22"/>
               </w:rPr>
               <w:t>OK</w:t>
             </w:r>
@@ -983,9 +1414,14 @@
             <w:tcW w:type="dxa" w:w="1728"/>
           </w:tcPr>
           <w:p>
+            <w:pPr>
+              <w:spacing w:line="240" w:lineRule="auto"/>
+            </w:pPr>
             <w:r>
               <w:rPr>
-                <w:sz w:val="18"/>
+                <w:rFonts w:ascii="Times New Roman" w:hAnsi="Times New Roman"/>
+                <w:color w:val="000000"/>
+                <w:sz w:val="22"/>
               </w:rPr>
               <w:t>Pila</w:t>
             </w:r>
@@ -996,9 +1432,14 @@
             <w:tcW w:type="dxa" w:w="1728"/>
           </w:tcPr>
           <w:p>
+            <w:pPr>
+              <w:spacing w:line="240" w:lineRule="auto"/>
+            </w:pPr>
             <w:r>
               <w:rPr>
-                <w:sz w:val="18"/>
+                <w:rFonts w:ascii="Times New Roman" w:hAnsi="Times New Roman"/>
+                <w:color w:val="000000"/>
+                <w:sz w:val="22"/>
               </w:rPr>
               <w:t>test_acepta_none_y_tipos_mezclados</w:t>
             </w:r>
@@ -1009,9 +1450,14 @@
             <w:tcW w:type="dxa" w:w="1728"/>
           </w:tcPr>
           <w:p>
+            <w:pPr>
+              <w:spacing w:line="240" w:lineRule="auto"/>
+            </w:pPr>
             <w:r>
               <w:rPr>
-                <w:sz w:val="18"/>
+                <w:rFonts w:ascii="Times New Roman" w:hAnsi="Times New Roman"/>
+                <w:color w:val="000000"/>
+                <w:sz w:val="22"/>
               </w:rPr>
               <w:t>push None y 'x', dos pop</w:t>
             </w:r>
@@ -1022,9 +1468,14 @@
             <w:tcW w:type="dxa" w:w="1728"/>
           </w:tcPr>
           <w:p>
+            <w:pPr>
+              <w:spacing w:line="240" w:lineRule="auto"/>
+            </w:pPr>
             <w:r>
               <w:rPr>
-                <w:sz w:val="18"/>
+                <w:rFonts w:ascii="Times New Roman" w:hAnsi="Times New Roman"/>
+                <w:color w:val="000000"/>
+                <w:sz w:val="22"/>
               </w:rPr>
               <w:t>salen 'x' y None, queda vacia</w:t>
             </w:r>
@@ -1035,9 +1486,14 @@
             <w:tcW w:type="dxa" w:w="1728"/>
           </w:tcPr>
           <w:p>
+            <w:pPr>
+              <w:spacing w:line="240" w:lineRule="auto"/>
+            </w:pPr>
             <w:r>
               <w:rPr>
-                <w:sz w:val="18"/>
+                <w:rFonts w:ascii="Times New Roman" w:hAnsi="Times New Roman"/>
+                <w:color w:val="000000"/>
+                <w:sz w:val="22"/>
               </w:rPr>
               <w:t>OK</w:t>
             </w:r>
@@ -1050,9 +1506,14 @@
             <w:tcW w:type="dxa" w:w="1728"/>
           </w:tcPr>
           <w:p>
+            <w:pPr>
+              <w:spacing w:line="240" w:lineRule="auto"/>
+            </w:pPr>
             <w:r>
               <w:rPr>
-                <w:sz w:val="18"/>
+                <w:rFonts w:ascii="Times New Roman" w:hAnsi="Times New Roman"/>
+                <w:color w:val="000000"/>
+                <w:sz w:val="22"/>
               </w:rPr>
               <w:t>Pila</w:t>
             </w:r>
@@ -1063,9 +1524,14 @@
             <w:tcW w:type="dxa" w:w="1728"/>
           </w:tcPr>
           <w:p>
+            <w:pPr>
+              <w:spacing w:line="240" w:lineRule="auto"/>
+            </w:pPr>
             <w:r>
               <w:rPr>
-                <w:sz w:val="18"/>
+                <w:rFonts w:ascii="Times New Roman" w:hAnsi="Times New Roman"/>
+                <w:color w:val="000000"/>
+                <w:sz w:val="22"/>
               </w:rPr>
               <w:t>test_repr</w:t>
             </w:r>
@@ -1076,9 +1542,14 @@
             <w:tcW w:type="dxa" w:w="1728"/>
           </w:tcPr>
           <w:p>
+            <w:pPr>
+              <w:spacing w:line="240" w:lineRule="auto"/>
+            </w:pPr>
             <w:r>
               <w:rPr>
-                <w:sz w:val="18"/>
+                <w:rFonts w:ascii="Times New Roman" w:hAnsi="Times New Roman"/>
+                <w:color w:val="000000"/>
+                <w:sz w:val="22"/>
               </w:rPr>
               <w:t>repr de pila con un 1</w:t>
             </w:r>
@@ -1089,9 +1560,14 @@
             <w:tcW w:type="dxa" w:w="1728"/>
           </w:tcPr>
           <w:p>
+            <w:pPr>
+              <w:spacing w:line="240" w:lineRule="auto"/>
+            </w:pPr>
             <w:r>
               <w:rPr>
-                <w:sz w:val="18"/>
+                <w:rFonts w:ascii="Times New Roman" w:hAnsi="Times New Roman"/>
+                <w:color w:val="000000"/>
+                <w:sz w:val="22"/>
               </w:rPr>
               <w:t>el texto contiene 1</w:t>
             </w:r>
@@ -1102,9 +1578,14 @@
             <w:tcW w:type="dxa" w:w="1728"/>
           </w:tcPr>
           <w:p>
+            <w:pPr>
+              <w:spacing w:line="240" w:lineRule="auto"/>
+            </w:pPr>
             <w:r>
               <w:rPr>
-                <w:sz w:val="18"/>
+                <w:rFonts w:ascii="Times New Roman" w:hAnsi="Times New Roman"/>
+                <w:color w:val="000000"/>
+                <w:sz w:val="22"/>
               </w:rPr>
               <w:t>OK</w:t>
             </w:r>
@@ -1117,9 +1598,14 @@
             <w:tcW w:type="dxa" w:w="1728"/>
           </w:tcPr>
           <w:p>
+            <w:pPr>
+              <w:spacing w:line="240" w:lineRule="auto"/>
+            </w:pPr>
             <w:r>
               <w:rPr>
-                <w:sz w:val="18"/>
+                <w:rFonts w:ascii="Times New Roman" w:hAnsi="Times New Roman"/>
+                <w:color w:val="000000"/>
+                <w:sz w:val="22"/>
               </w:rPr>
               <w:t>Cola</w:t>
             </w:r>
@@ -1130,9 +1616,14 @@
             <w:tcW w:type="dxa" w:w="1728"/>
           </w:tcPr>
           <w:p>
+            <w:pPr>
+              <w:spacing w:line="240" w:lineRule="auto"/>
+            </w:pPr>
             <w:r>
               <w:rPr>
-                <w:sz w:val="18"/>
+                <w:rFonts w:ascii="Times New Roman" w:hAnsi="Times New Roman"/>
+                <w:color w:val="000000"/>
+                <w:sz w:val="22"/>
               </w:rPr>
               <w:t>test_cola_nueva_esta_vacia</w:t>
             </w:r>
@@ -1143,9 +1634,14 @@
             <w:tcW w:type="dxa" w:w="1728"/>
           </w:tcPr>
           <w:p>
+            <w:pPr>
+              <w:spacing w:line="240" w:lineRule="auto"/>
+            </w:pPr>
             <w:r>
               <w:rPr>
-                <w:sz w:val="18"/>
+                <w:rFonts w:ascii="Times New Roman" w:hAnsi="Times New Roman"/>
+                <w:color w:val="000000"/>
+                <w:sz w:val="22"/>
               </w:rPr>
               <w:t>Cola()</w:t>
             </w:r>
@@ -1156,9 +1652,14 @@
             <w:tcW w:type="dxa" w:w="1728"/>
           </w:tcPr>
           <w:p>
+            <w:pPr>
+              <w:spacing w:line="240" w:lineRule="auto"/>
+            </w:pPr>
             <w:r>
               <w:rPr>
-                <w:sz w:val="18"/>
+                <w:rFonts w:ascii="Times New Roman" w:hAnsi="Times New Roman"/>
+                <w:color w:val="000000"/>
+                <w:sz w:val="22"/>
               </w:rPr>
               <w:t>is_empty() es True y size() es 0</w:t>
             </w:r>
@@ -1169,9 +1670,14 @@
             <w:tcW w:type="dxa" w:w="1728"/>
           </w:tcPr>
           <w:p>
+            <w:pPr>
+              <w:spacing w:line="240" w:lineRule="auto"/>
+            </w:pPr>
             <w:r>
               <w:rPr>
-                <w:sz w:val="18"/>
+                <w:rFonts w:ascii="Times New Roman" w:hAnsi="Times New Roman"/>
+                <w:color w:val="000000"/>
+                <w:sz w:val="22"/>
               </w:rPr>
               <w:t>OK</w:t>
             </w:r>
@@ -1184,9 +1690,14 @@
             <w:tcW w:type="dxa" w:w="1728"/>
           </w:tcPr>
           <w:p>
+            <w:pPr>
+              <w:spacing w:line="240" w:lineRule="auto"/>
+            </w:pPr>
             <w:r>
               <w:rPr>
-                <w:sz w:val="18"/>
+                <w:rFonts w:ascii="Times New Roman" w:hAnsi="Times New Roman"/>
+                <w:color w:val="000000"/>
+                <w:sz w:val="22"/>
               </w:rPr>
               <w:t>Cola</w:t>
             </w:r>
@@ -1197,9 +1708,14 @@
             <w:tcW w:type="dxa" w:w="1728"/>
           </w:tcPr>
           <w:p>
+            <w:pPr>
+              <w:spacing w:line="240" w:lineRule="auto"/>
+            </w:pPr>
             <w:r>
               <w:rPr>
-                <w:sz w:val="18"/>
+                <w:rFonts w:ascii="Times New Roman" w:hAnsi="Times New Roman"/>
+                <w:color w:val="000000"/>
+                <w:sz w:val="22"/>
               </w:rPr>
               <w:t>test_enqueue_y_dequeue_fifo</w:t>
             </w:r>
@@ -1210,9 +1726,14 @@
             <w:tcW w:type="dxa" w:w="1728"/>
           </w:tcPr>
           <w:p>
+            <w:pPr>
+              <w:spacing w:line="240" w:lineRule="auto"/>
+            </w:pPr>
             <w:r>
               <w:rPr>
-                <w:sz w:val="18"/>
+                <w:rFonts w:ascii="Times New Roman" w:hAnsi="Times New Roman"/>
+                <w:color w:val="000000"/>
+                <w:sz w:val="22"/>
               </w:rPr>
               <w:t>enqueue 1, 2, 3 y tres dequeue</w:t>
             </w:r>
@@ -1223,9 +1744,14 @@
             <w:tcW w:type="dxa" w:w="1728"/>
           </w:tcPr>
           <w:p>
+            <w:pPr>
+              <w:spacing w:line="240" w:lineRule="auto"/>
+            </w:pPr>
             <w:r>
               <w:rPr>
-                <w:sz w:val="18"/>
+                <w:rFonts w:ascii="Times New Roman" w:hAnsi="Times New Roman"/>
+                <w:color w:val="000000"/>
+                <w:sz w:val="22"/>
               </w:rPr>
               <w:t>salen 1, 2, 3</w:t>
             </w:r>
@@ -1236,9 +1762,14 @@
             <w:tcW w:type="dxa" w:w="1728"/>
           </w:tcPr>
           <w:p>
+            <w:pPr>
+              <w:spacing w:line="240" w:lineRule="auto"/>
+            </w:pPr>
             <w:r>
               <w:rPr>
-                <w:sz w:val="18"/>
+                <w:rFonts w:ascii="Times New Roman" w:hAnsi="Times New Roman"/>
+                <w:color w:val="000000"/>
+                <w:sz w:val="22"/>
               </w:rPr>
               <w:t>OK</w:t>
             </w:r>
@@ -1251,9 +1782,14 @@
             <w:tcW w:type="dxa" w:w="1728"/>
           </w:tcPr>
           <w:p>
+            <w:pPr>
+              <w:spacing w:line="240" w:lineRule="auto"/>
+            </w:pPr>
             <w:r>
               <w:rPr>
-                <w:sz w:val="18"/>
+                <w:rFonts w:ascii="Times New Roman" w:hAnsi="Times New Roman"/>
+                <w:color w:val="000000"/>
+                <w:sz w:val="22"/>
               </w:rPr>
               <w:t>Cola</w:t>
             </w:r>
@@ -1264,9 +1800,14 @@
             <w:tcW w:type="dxa" w:w="1728"/>
           </w:tcPr>
           <w:p>
+            <w:pPr>
+              <w:spacing w:line="240" w:lineRule="auto"/>
+            </w:pPr>
             <w:r>
               <w:rPr>
-                <w:sz w:val="18"/>
+                <w:rFonts w:ascii="Times New Roman" w:hAnsi="Times New Roman"/>
+                <w:color w:val="000000"/>
+                <w:sz w:val="22"/>
               </w:rPr>
               <w:t>test_front_y_peek_no_sacan</w:t>
             </w:r>
@@ -1277,9 +1818,14 @@
             <w:tcW w:type="dxa" w:w="1728"/>
           </w:tcPr>
           <w:p>
+            <w:pPr>
+              <w:spacing w:line="240" w:lineRule="auto"/>
+            </w:pPr>
             <w:r>
               <w:rPr>
-                <w:sz w:val="18"/>
+                <w:rFonts w:ascii="Times New Roman" w:hAnsi="Times New Roman"/>
+                <w:color w:val="000000"/>
+                <w:sz w:val="22"/>
               </w:rPr>
               <w:t>enqueue a, b; front y peek</w:t>
             </w:r>
@@ -1290,9 +1836,14 @@
             <w:tcW w:type="dxa" w:w="1728"/>
           </w:tcPr>
           <w:p>
+            <w:pPr>
+              <w:spacing w:line="240" w:lineRule="auto"/>
+            </w:pPr>
             <w:r>
               <w:rPr>
-                <w:sz w:val="18"/>
+                <w:rFonts w:ascii="Times New Roman" w:hAnsi="Times New Roman"/>
+                <w:color w:val="000000"/>
+                <w:sz w:val="22"/>
               </w:rPr>
               <w:t>ambos regresan a y size sigue en 2</w:t>
             </w:r>
@@ -1303,9 +1854,14 @@
             <w:tcW w:type="dxa" w:w="1728"/>
           </w:tcPr>
           <w:p>
+            <w:pPr>
+              <w:spacing w:line="240" w:lineRule="auto"/>
+            </w:pPr>
             <w:r>
               <w:rPr>
-                <w:sz w:val="18"/>
+                <w:rFonts w:ascii="Times New Roman" w:hAnsi="Times New Roman"/>
+                <w:color w:val="000000"/>
+                <w:sz w:val="22"/>
               </w:rPr>
               <w:t>OK</w:t>
             </w:r>
@@ -1318,9 +1874,14 @@
             <w:tcW w:type="dxa" w:w="1728"/>
           </w:tcPr>
           <w:p>
+            <w:pPr>
+              <w:spacing w:line="240" w:lineRule="auto"/>
+            </w:pPr>
             <w:r>
               <w:rPr>
-                <w:sz w:val="18"/>
+                <w:rFonts w:ascii="Times New Roman" w:hAnsi="Times New Roman"/>
+                <w:color w:val="000000"/>
+                <w:sz w:val="22"/>
               </w:rPr>
               <w:t>Cola</w:t>
             </w:r>
@@ -1331,9 +1892,14 @@
             <w:tcW w:type="dxa" w:w="1728"/>
           </w:tcPr>
           <w:p>
+            <w:pPr>
+              <w:spacing w:line="240" w:lineRule="auto"/>
+            </w:pPr>
             <w:r>
               <w:rPr>
-                <w:sz w:val="18"/>
+                <w:rFonts w:ascii="Times New Roman" w:hAnsi="Times New Roman"/>
+                <w:color w:val="000000"/>
+                <w:sz w:val="22"/>
               </w:rPr>
               <w:t>test_dequeue_cola_vacia</w:t>
             </w:r>
@@ -1344,9 +1910,14 @@
             <w:tcW w:type="dxa" w:w="1728"/>
           </w:tcPr>
           <w:p>
+            <w:pPr>
+              <w:spacing w:line="240" w:lineRule="auto"/>
+            </w:pPr>
             <w:r>
               <w:rPr>
-                <w:sz w:val="18"/>
+                <w:rFonts w:ascii="Times New Roman" w:hAnsi="Times New Roman"/>
+                <w:color w:val="000000"/>
+                <w:sz w:val="22"/>
               </w:rPr>
               <w:t>dequeue sobre cola vacia</w:t>
             </w:r>
@@ -1357,9 +1928,14 @@
             <w:tcW w:type="dxa" w:w="1728"/>
           </w:tcPr>
           <w:p>
+            <w:pPr>
+              <w:spacing w:line="240" w:lineRule="auto"/>
+            </w:pPr>
             <w:r>
               <w:rPr>
-                <w:sz w:val="18"/>
+                <w:rFonts w:ascii="Times New Roman" w:hAnsi="Times New Roman"/>
+                <w:color w:val="000000"/>
+                <w:sz w:val="22"/>
               </w:rPr>
               <w:t>IndexError</w:t>
             </w:r>
@@ -1370,9 +1946,14 @@
             <w:tcW w:type="dxa" w:w="1728"/>
           </w:tcPr>
           <w:p>
+            <w:pPr>
+              <w:spacing w:line="240" w:lineRule="auto"/>
+            </w:pPr>
             <w:r>
               <w:rPr>
-                <w:sz w:val="18"/>
+                <w:rFonts w:ascii="Times New Roman" w:hAnsi="Times New Roman"/>
+                <w:color w:val="000000"/>
+                <w:sz w:val="22"/>
               </w:rPr>
               <w:t>OK</w:t>
             </w:r>
@@ -1385,9 +1966,14 @@
             <w:tcW w:type="dxa" w:w="1728"/>
           </w:tcPr>
           <w:p>
+            <w:pPr>
+              <w:spacing w:line="240" w:lineRule="auto"/>
+            </w:pPr>
             <w:r>
               <w:rPr>
-                <w:sz w:val="18"/>
+                <w:rFonts w:ascii="Times New Roman" w:hAnsi="Times New Roman"/>
+                <w:color w:val="000000"/>
+                <w:sz w:val="22"/>
               </w:rPr>
               <w:t>Cola</w:t>
             </w:r>
@@ -1398,9 +1984,14 @@
             <w:tcW w:type="dxa" w:w="1728"/>
           </w:tcPr>
           <w:p>
+            <w:pPr>
+              <w:spacing w:line="240" w:lineRule="auto"/>
+            </w:pPr>
             <w:r>
               <w:rPr>
-                <w:sz w:val="18"/>
+                <w:rFonts w:ascii="Times New Roman" w:hAnsi="Times New Roman"/>
+                <w:color w:val="000000"/>
+                <w:sz w:val="22"/>
               </w:rPr>
               <w:t>test_front_cola_vacia</w:t>
             </w:r>
@@ -1411,9 +2002,14 @@
             <w:tcW w:type="dxa" w:w="1728"/>
           </w:tcPr>
           <w:p>
+            <w:pPr>
+              <w:spacing w:line="240" w:lineRule="auto"/>
+            </w:pPr>
             <w:r>
               <w:rPr>
-                <w:sz w:val="18"/>
+                <w:rFonts w:ascii="Times New Roman" w:hAnsi="Times New Roman"/>
+                <w:color w:val="000000"/>
+                <w:sz w:val="22"/>
               </w:rPr>
               <w:t>front sobre cola vacia</w:t>
             </w:r>
@@ -1424,9 +2020,14 @@
             <w:tcW w:type="dxa" w:w="1728"/>
           </w:tcPr>
           <w:p>
+            <w:pPr>
+              <w:spacing w:line="240" w:lineRule="auto"/>
+            </w:pPr>
             <w:r>
               <w:rPr>
-                <w:sz w:val="18"/>
+                <w:rFonts w:ascii="Times New Roman" w:hAnsi="Times New Roman"/>
+                <w:color w:val="000000"/>
+                <w:sz w:val="22"/>
               </w:rPr>
               <w:t>IndexError</w:t>
             </w:r>
@@ -1437,9 +2038,14 @@
             <w:tcW w:type="dxa" w:w="1728"/>
           </w:tcPr>
           <w:p>
+            <w:pPr>
+              <w:spacing w:line="240" w:lineRule="auto"/>
+            </w:pPr>
             <w:r>
               <w:rPr>
-                <w:sz w:val="18"/>
+                <w:rFonts w:ascii="Times New Roman" w:hAnsi="Times New Roman"/>
+                <w:color w:val="000000"/>
+                <w:sz w:val="22"/>
               </w:rPr>
               <w:t>OK</w:t>
             </w:r>
@@ -1452,9 +2058,14 @@
             <w:tcW w:type="dxa" w:w="1728"/>
           </w:tcPr>
           <w:p>
+            <w:pPr>
+              <w:spacing w:line="240" w:lineRule="auto"/>
+            </w:pPr>
             <w:r>
               <w:rPr>
-                <w:sz w:val="18"/>
+                <w:rFonts w:ascii="Times New Roman" w:hAnsi="Times New Roman"/>
+                <w:color w:val="000000"/>
+                <w:sz w:val="22"/>
               </w:rPr>
               <w:t>Cola</w:t>
             </w:r>
@@ -1465,9 +2076,14 @@
             <w:tcW w:type="dxa" w:w="1728"/>
           </w:tcPr>
           <w:p>
+            <w:pPr>
+              <w:spacing w:line="240" w:lineRule="auto"/>
+            </w:pPr>
             <w:r>
               <w:rPr>
-                <w:sz w:val="18"/>
+                <w:rFonts w:ascii="Times New Roman" w:hAnsi="Times New Roman"/>
+                <w:color w:val="000000"/>
+                <w:sz w:val="22"/>
               </w:rPr>
               <w:t>test_un_solo_elemento</w:t>
             </w:r>
@@ -1478,9 +2094,14 @@
             <w:tcW w:type="dxa" w:w="1728"/>
           </w:tcPr>
           <w:p>
+            <w:pPr>
+              <w:spacing w:line="240" w:lineRule="auto"/>
+            </w:pPr>
             <w:r>
               <w:rPr>
-                <w:sz w:val="18"/>
+                <w:rFonts w:ascii="Times New Roman" w:hAnsi="Times New Roman"/>
+                <w:color w:val="000000"/>
+                <w:sz w:val="22"/>
               </w:rPr>
               <w:t>enqueue 5 y dequeue</w:t>
             </w:r>
@@ -1491,9 +2112,14 @@
             <w:tcW w:type="dxa" w:w="1728"/>
           </w:tcPr>
           <w:p>
+            <w:pPr>
+              <w:spacing w:line="240" w:lineRule="auto"/>
+            </w:pPr>
             <w:r>
               <w:rPr>
-                <w:sz w:val="18"/>
+                <w:rFonts w:ascii="Times New Roman" w:hAnsi="Times New Roman"/>
+                <w:color w:val="000000"/>
+                <w:sz w:val="22"/>
               </w:rPr>
               <w:t>regresa 5 y queda vacia</w:t>
             </w:r>
@@ -1504,9 +2130,14 @@
             <w:tcW w:type="dxa" w:w="1728"/>
           </w:tcPr>
           <w:p>
+            <w:pPr>
+              <w:spacing w:line="240" w:lineRule="auto"/>
+            </w:pPr>
             <w:r>
               <w:rPr>
-                <w:sz w:val="18"/>
+                <w:rFonts w:ascii="Times New Roman" w:hAnsi="Times New Roman"/>
+                <w:color w:val="000000"/>
+                <w:sz w:val="22"/>
               </w:rPr>
               <w:t>OK</w:t>
             </w:r>
@@ -1519,9 +2150,14 @@
             <w:tcW w:type="dxa" w:w="1728"/>
           </w:tcPr>
           <w:p>
+            <w:pPr>
+              <w:spacing w:line="240" w:lineRule="auto"/>
+            </w:pPr>
             <w:r>
               <w:rPr>
-                <w:sz w:val="18"/>
+                <w:rFonts w:ascii="Times New Roman" w:hAnsi="Times New Roman"/>
+                <w:color w:val="000000"/>
+                <w:sz w:val="22"/>
               </w:rPr>
               <w:t>Cola</w:t>
             </w:r>
@@ -1532,9 +2168,14 @@
             <w:tcW w:type="dxa" w:w="1728"/>
           </w:tcPr>
           <w:p>
+            <w:pPr>
+              <w:spacing w:line="240" w:lineRule="auto"/>
+            </w:pPr>
             <w:r>
               <w:rPr>
-                <w:sz w:val="18"/>
+                <w:rFonts w:ascii="Times New Roman" w:hAnsi="Times New Roman"/>
+                <w:color w:val="000000"/>
+                <w:sz w:val="22"/>
               </w:rPr>
               <w:t>test_vaciar_y_volver_a_usar</w:t>
             </w:r>
@@ -1545,9 +2186,14 @@
             <w:tcW w:type="dxa" w:w="1728"/>
           </w:tcPr>
           <w:p>
+            <w:pPr>
+              <w:spacing w:line="240" w:lineRule="auto"/>
+            </w:pPr>
             <w:r>
               <w:rPr>
-                <w:sz w:val="18"/>
+                <w:rFonts w:ascii="Times New Roman" w:hAnsi="Times New Roman"/>
+                <w:color w:val="000000"/>
+                <w:sz w:val="22"/>
               </w:rPr>
               <w:t>enqueue 1, dequeue, enqueue 2 y 3</w:t>
             </w:r>
@@ -1558,9 +2204,14 @@
             <w:tcW w:type="dxa" w:w="1728"/>
           </w:tcPr>
           <w:p>
+            <w:pPr>
+              <w:spacing w:line="240" w:lineRule="auto"/>
+            </w:pPr>
             <w:r>
               <w:rPr>
-                <w:sz w:val="18"/>
+                <w:rFonts w:ascii="Times New Roman" w:hAnsi="Times New Roman"/>
+                <w:color w:val="000000"/>
+                <w:sz w:val="22"/>
               </w:rPr>
               <w:t>contenido [2, 3], dequeue da 2</w:t>
             </w:r>
@@ -1571,9 +2222,14 @@
             <w:tcW w:type="dxa" w:w="1728"/>
           </w:tcPr>
           <w:p>
+            <w:pPr>
+              <w:spacing w:line="240" w:lineRule="auto"/>
+            </w:pPr>
             <w:r>
               <w:rPr>
-                <w:sz w:val="18"/>
+                <w:rFonts w:ascii="Times New Roman" w:hAnsi="Times New Roman"/>
+                <w:color w:val="000000"/>
+                <w:sz w:val="22"/>
               </w:rPr>
               <w:t>OK</w:t>
             </w:r>
@@ -1586,9 +2242,14 @@
             <w:tcW w:type="dxa" w:w="1728"/>
           </w:tcPr>
           <w:p>
+            <w:pPr>
+              <w:spacing w:line="240" w:lineRule="auto"/>
+            </w:pPr>
             <w:r>
               <w:rPr>
-                <w:sz w:val="18"/>
+                <w:rFonts w:ascii="Times New Roman" w:hAnsi="Times New Roman"/>
+                <w:color w:val="000000"/>
+                <w:sz w:val="22"/>
               </w:rPr>
               <w:t>Cola</w:t>
             </w:r>
@@ -1599,9 +2260,14 @@
             <w:tcW w:type="dxa" w:w="1728"/>
           </w:tcPr>
           <w:p>
+            <w:pPr>
+              <w:spacing w:line="240" w:lineRule="auto"/>
+            </w:pPr>
             <w:r>
               <w:rPr>
-                <w:sz w:val="18"/>
+                <w:rFonts w:ascii="Times New Roman" w:hAnsi="Times New Roman"/>
+                <w:color w:val="000000"/>
+                <w:sz w:val="22"/>
               </w:rPr>
               <w:t>test_clear</w:t>
             </w:r>
@@ -1612,9 +2278,14 @@
             <w:tcW w:type="dxa" w:w="1728"/>
           </w:tcPr>
           <w:p>
+            <w:pPr>
+              <w:spacing w:line="240" w:lineRule="auto"/>
+            </w:pPr>
             <w:r>
               <w:rPr>
-                <w:sz w:val="18"/>
+                <w:rFonts w:ascii="Times New Roman" w:hAnsi="Times New Roman"/>
+                <w:color w:val="000000"/>
+                <w:sz w:val="22"/>
               </w:rPr>
               <w:t>enqueue 1, 2, clear y enqueue 9</w:t>
             </w:r>
@@ -1625,9 +2296,14 @@
             <w:tcW w:type="dxa" w:w="1728"/>
           </w:tcPr>
           <w:p>
+            <w:pPr>
+              <w:spacing w:line="240" w:lineRule="auto"/>
+            </w:pPr>
             <w:r>
               <w:rPr>
-                <w:sz w:val="18"/>
+                <w:rFonts w:ascii="Times New Roman" w:hAnsi="Times New Roman"/>
+                <w:color w:val="000000"/>
+                <w:sz w:val="22"/>
               </w:rPr>
               <w:t>queda vacia y luego front es 9</w:t>
             </w:r>
@@ -1638,9 +2314,14 @@
             <w:tcW w:type="dxa" w:w="1728"/>
           </w:tcPr>
           <w:p>
+            <w:pPr>
+              <w:spacing w:line="240" w:lineRule="auto"/>
+            </w:pPr>
             <w:r>
               <w:rPr>
-                <w:sz w:val="18"/>
+                <w:rFonts w:ascii="Times New Roman" w:hAnsi="Times New Roman"/>
+                <w:color w:val="000000"/>
+                <w:sz w:val="22"/>
               </w:rPr>
               <w:t>OK</w:t>
             </w:r>
@@ -1653,9 +2334,14 @@
             <w:tcW w:type="dxa" w:w="1728"/>
           </w:tcPr>
           <w:p>
+            <w:pPr>
+              <w:spacing w:line="240" w:lineRule="auto"/>
+            </w:pPr>
             <w:r>
               <w:rPr>
-                <w:sz w:val="18"/>
+                <w:rFonts w:ascii="Times New Roman" w:hAnsi="Times New Roman"/>
+                <w:color w:val="000000"/>
+                <w:sz w:val="22"/>
               </w:rPr>
               <w:t>Cola</w:t>
             </w:r>
@@ -1666,9 +2352,14 @@
             <w:tcW w:type="dxa" w:w="1728"/>
           </w:tcPr>
           <w:p>
+            <w:pPr>
+              <w:spacing w:line="240" w:lineRule="auto"/>
+            </w:pPr>
             <w:r>
               <w:rPr>
-                <w:sz w:val="18"/>
+                <w:rFonts w:ascii="Times New Roman" w:hAnsi="Times New Roman"/>
+                <w:color w:val="000000"/>
+                <w:sz w:val="22"/>
               </w:rPr>
               <w:t>test_muchos_elementos</w:t>
             </w:r>
@@ -1679,9 +2370,14 @@
             <w:tcW w:type="dxa" w:w="1728"/>
           </w:tcPr>
           <w:p>
+            <w:pPr>
+              <w:spacing w:line="240" w:lineRule="auto"/>
+            </w:pPr>
             <w:r>
               <w:rPr>
-                <w:sz w:val="18"/>
+                <w:rFonts w:ascii="Times New Roman" w:hAnsi="Times New Roman"/>
+                <w:color w:val="000000"/>
+                <w:sz w:val="22"/>
               </w:rPr>
               <w:t>10000 enqueue, dequeue y front</w:t>
             </w:r>
@@ -1692,9 +2388,14 @@
             <w:tcW w:type="dxa" w:w="1728"/>
           </w:tcPr>
           <w:p>
+            <w:pPr>
+              <w:spacing w:line="240" w:lineRule="auto"/>
+            </w:pPr>
             <w:r>
               <w:rPr>
-                <w:sz w:val="18"/>
+                <w:rFonts w:ascii="Times New Roman" w:hAnsi="Times New Roman"/>
+                <w:color w:val="000000"/>
+                <w:sz w:val="22"/>
               </w:rPr>
               <w:t>len 10000, dequeue 0, front 1</w:t>
             </w:r>
@@ -1705,9 +2406,14 @@
             <w:tcW w:type="dxa" w:w="1728"/>
           </w:tcPr>
           <w:p>
+            <w:pPr>
+              <w:spacing w:line="240" w:lineRule="auto"/>
+            </w:pPr>
             <w:r>
               <w:rPr>
-                <w:sz w:val="18"/>
+                <w:rFonts w:ascii="Times New Roman" w:hAnsi="Times New Roman"/>
+                <w:color w:val="000000"/>
+                <w:sz w:val="22"/>
               </w:rPr>
               <w:t>OK</w:t>
             </w:r>
@@ -1720,9 +2426,14 @@
             <w:tcW w:type="dxa" w:w="1728"/>
           </w:tcPr>
           <w:p>
+            <w:pPr>
+              <w:spacing w:line="240" w:lineRule="auto"/>
+            </w:pPr>
             <w:r>
               <w:rPr>
-                <w:sz w:val="18"/>
+                <w:rFonts w:ascii="Times New Roman" w:hAnsi="Times New Roman"/>
+                <w:color w:val="000000"/>
+                <w:sz w:val="22"/>
               </w:rPr>
               <w:t>Cola</w:t>
             </w:r>
@@ -1733,9 +2444,14 @@
             <w:tcW w:type="dxa" w:w="1728"/>
           </w:tcPr>
           <w:p>
+            <w:pPr>
+              <w:spacing w:line="240" w:lineRule="auto"/>
+            </w:pPr>
             <w:r>
               <w:rPr>
-                <w:sz w:val="18"/>
+                <w:rFonts w:ascii="Times New Roman" w:hAnsi="Times New Roman"/>
+                <w:color w:val="000000"/>
+                <w:sz w:val="22"/>
               </w:rPr>
               <w:t>test_iteracion_en_orden_de_salida</w:t>
             </w:r>
@@ -1746,9 +2462,14 @@
             <w:tcW w:type="dxa" w:w="1728"/>
           </w:tcPr>
           <w:p>
+            <w:pPr>
+              <w:spacing w:line="240" w:lineRule="auto"/>
+            </w:pPr>
             <w:r>
               <w:rPr>
-                <w:sz w:val="18"/>
+                <w:rFonts w:ascii="Times New Roman" w:hAnsi="Times New Roman"/>
+                <w:color w:val="000000"/>
+                <w:sz w:val="22"/>
               </w:rPr>
               <w:t>enqueue a, b, c y list(cola)</w:t>
             </w:r>
@@ -1759,9 +2480,14 @@
             <w:tcW w:type="dxa" w:w="1728"/>
           </w:tcPr>
           <w:p>
+            <w:pPr>
+              <w:spacing w:line="240" w:lineRule="auto"/>
+            </w:pPr>
             <w:r>
               <w:rPr>
-                <w:sz w:val="18"/>
+                <w:rFonts w:ascii="Times New Roman" w:hAnsi="Times New Roman"/>
+                <w:color w:val="000000"/>
+                <w:sz w:val="22"/>
               </w:rPr>
               <w:t>['a', 'b', 'c'], len 3</w:t>
             </w:r>
@@ -1772,9 +2498,14 @@
             <w:tcW w:type="dxa" w:w="1728"/>
           </w:tcPr>
           <w:p>
+            <w:pPr>
+              <w:spacing w:line="240" w:lineRule="auto"/>
+            </w:pPr>
             <w:r>
               <w:rPr>
-                <w:sz w:val="18"/>
+                <w:rFonts w:ascii="Times New Roman" w:hAnsi="Times New Roman"/>
+                <w:color w:val="000000"/>
+                <w:sz w:val="22"/>
               </w:rPr>
               <w:t>OK</w:t>
             </w:r>
@@ -1787,9 +2518,14 @@
             <w:tcW w:type="dxa" w:w="1728"/>
           </w:tcPr>
           <w:p>
+            <w:pPr>
+              <w:spacing w:line="240" w:lineRule="auto"/>
+            </w:pPr>
             <w:r>
               <w:rPr>
-                <w:sz w:val="18"/>
+                <w:rFonts w:ascii="Times New Roman" w:hAnsi="Times New Roman"/>
+                <w:color w:val="000000"/>
+                <w:sz w:val="22"/>
               </w:rPr>
               <w:t>Cola</w:t>
             </w:r>
@@ -1800,9 +2536,14 @@
             <w:tcW w:type="dxa" w:w="1728"/>
           </w:tcPr>
           <w:p>
+            <w:pPr>
+              <w:spacing w:line="240" w:lineRule="auto"/>
+            </w:pPr>
             <w:r>
               <w:rPr>
-                <w:sz w:val="18"/>
+                <w:rFonts w:ascii="Times New Roman" w:hAnsi="Times New Roman"/>
+                <w:color w:val="000000"/>
+                <w:sz w:val="22"/>
               </w:rPr>
               <w:t>test_intercalar_enqueue_y_dequeue</w:t>
             </w:r>
@@ -1813,9 +2554,14 @@
             <w:tcW w:type="dxa" w:w="1728"/>
           </w:tcPr>
           <w:p>
+            <w:pPr>
+              <w:spacing w:line="240" w:lineRule="auto"/>
+            </w:pPr>
             <w:r>
               <w:rPr>
-                <w:sz w:val="18"/>
+                <w:rFonts w:ascii="Times New Roman" w:hAnsi="Times New Roman"/>
+                <w:color w:val="000000"/>
+                <w:sz w:val="22"/>
               </w:rPr>
               <w:t>enqueue 1, 2, dequeue, enqueue 3</w:t>
             </w:r>
@@ -1826,9 +2572,14 @@
             <w:tcW w:type="dxa" w:w="1728"/>
           </w:tcPr>
           <w:p>
+            <w:pPr>
+              <w:spacing w:line="240" w:lineRule="auto"/>
+            </w:pPr>
             <w:r>
               <w:rPr>
-                <w:sz w:val="18"/>
+                <w:rFonts w:ascii="Times New Roman" w:hAnsi="Times New Roman"/>
+                <w:color w:val="000000"/>
+                <w:sz w:val="22"/>
               </w:rPr>
               <w:t>dequeue da 1, contenido [2, 3]</w:t>
             </w:r>
@@ -1839,9 +2590,14 @@
             <w:tcW w:type="dxa" w:w="1728"/>
           </w:tcPr>
           <w:p>
+            <w:pPr>
+              <w:spacing w:line="240" w:lineRule="auto"/>
+            </w:pPr>
             <w:r>
               <w:rPr>
-                <w:sz w:val="18"/>
+                <w:rFonts w:ascii="Times New Roman" w:hAnsi="Times New Roman"/>
+                <w:color w:val="000000"/>
+                <w:sz w:val="22"/>
               </w:rPr>
               <w:t>OK</w:t>
             </w:r>
@@ -1854,9 +2610,14 @@
             <w:tcW w:type="dxa" w:w="1728"/>
           </w:tcPr>
           <w:p>
+            <w:pPr>
+              <w:spacing w:line="240" w:lineRule="auto"/>
+            </w:pPr>
             <w:r>
               <w:rPr>
-                <w:sz w:val="18"/>
+                <w:rFonts w:ascii="Times New Roman" w:hAnsi="Times New Roman"/>
+                <w:color w:val="000000"/>
+                <w:sz w:val="22"/>
               </w:rPr>
               <w:t>Cola</w:t>
             </w:r>
@@ -1867,9 +2628,14 @@
             <w:tcW w:type="dxa" w:w="1728"/>
           </w:tcPr>
           <w:p>
+            <w:pPr>
+              <w:spacing w:line="240" w:lineRule="auto"/>
+            </w:pPr>
             <w:r>
               <w:rPr>
-                <w:sz w:val="18"/>
+                <w:rFonts w:ascii="Times New Roman" w:hAnsi="Times New Roman"/>
+                <w:color w:val="000000"/>
+                <w:sz w:val="22"/>
               </w:rPr>
               <w:t>test_repr</w:t>
             </w:r>
@@ -1880,9 +2646,14 @@
             <w:tcW w:type="dxa" w:w="1728"/>
           </w:tcPr>
           <w:p>
+            <w:pPr>
+              <w:spacing w:line="240" w:lineRule="auto"/>
+            </w:pPr>
             <w:r>
               <w:rPr>
-                <w:sz w:val="18"/>
+                <w:rFonts w:ascii="Times New Roman" w:hAnsi="Times New Roman"/>
+                <w:color w:val="000000"/>
+                <w:sz w:val="22"/>
               </w:rPr>
               <w:t>repr de cola con un 1</w:t>
             </w:r>
@@ -1893,9 +2664,14 @@
             <w:tcW w:type="dxa" w:w="1728"/>
           </w:tcPr>
           <w:p>
+            <w:pPr>
+              <w:spacing w:line="240" w:lineRule="auto"/>
+            </w:pPr>
             <w:r>
               <w:rPr>
-                <w:sz w:val="18"/>
+                <w:rFonts w:ascii="Times New Roman" w:hAnsi="Times New Roman"/>
+                <w:color w:val="000000"/>
+                <w:sz w:val="22"/>
               </w:rPr>
               <w:t>el texto contiene 1</w:t>
             </w:r>
@@ -1906,9 +2682,14 @@
             <w:tcW w:type="dxa" w:w="1728"/>
           </w:tcPr>
           <w:p>
+            <w:pPr>
+              <w:spacing w:line="240" w:lineRule="auto"/>
+            </w:pPr>
             <w:r>
               <w:rPr>
-                <w:sz w:val="18"/>
+                <w:rFonts w:ascii="Times New Roman" w:hAnsi="Times New Roman"/>
+                <w:color w:val="000000"/>
+                <w:sz w:val="22"/>
               </w:rPr>
               <w:t>OK</w:t>
             </w:r>
@@ -1921,9 +2702,14 @@
             <w:tcW w:type="dxa" w:w="1728"/>
           </w:tcPr>
           <w:p>
+            <w:pPr>
+              <w:spacing w:line="240" w:lineRule="auto"/>
+            </w:pPr>
             <w:r>
               <w:rPr>
-                <w:sz w:val="18"/>
+                <w:rFonts w:ascii="Times New Roman" w:hAnsi="Times New Roman"/>
+                <w:color w:val="000000"/>
+                <w:sz w:val="22"/>
               </w:rPr>
               <w:t>TablaHash</w:t>
             </w:r>
@@ -1934,9 +2720,14 @@
             <w:tcW w:type="dxa" w:w="1728"/>
           </w:tcPr>
           <w:p>
+            <w:pPr>
+              <w:spacing w:line="240" w:lineRule="auto"/>
+            </w:pPr>
             <w:r>
               <w:rPr>
-                <w:sz w:val="18"/>
+                <w:rFonts w:ascii="Times New Roman" w:hAnsi="Times New Roman"/>
+                <w:color w:val="000000"/>
+                <w:sz w:val="22"/>
               </w:rPr>
               <w:t>test_tabla_nueva_esta_vacia</w:t>
             </w:r>
@@ -1947,9 +2738,14 @@
             <w:tcW w:type="dxa" w:w="1728"/>
           </w:tcPr>
           <w:p>
+            <w:pPr>
+              <w:spacing w:line="240" w:lineRule="auto"/>
+            </w:pPr>
             <w:r>
               <w:rPr>
-                <w:sz w:val="18"/>
+                <w:rFonts w:ascii="Times New Roman" w:hAnsi="Times New Roman"/>
+                <w:color w:val="000000"/>
+                <w:sz w:val="22"/>
               </w:rPr>
               <w:t>TablaHash()</w:t>
             </w:r>
@@ -1960,9 +2756,14 @@
             <w:tcW w:type="dxa" w:w="1728"/>
           </w:tcPr>
           <w:p>
+            <w:pPr>
+              <w:spacing w:line="240" w:lineRule="auto"/>
+            </w:pPr>
             <w:r>
               <w:rPr>
-                <w:sz w:val="18"/>
+                <w:rFonts w:ascii="Times New Roman" w:hAnsi="Times New Roman"/>
+                <w:color w:val="000000"/>
+                <w:sz w:val="22"/>
               </w:rPr>
               <w:t>len 0 y keys() vacio</w:t>
             </w:r>
@@ -1973,9 +2774,14 @@
             <w:tcW w:type="dxa" w:w="1728"/>
           </w:tcPr>
           <w:p>
+            <w:pPr>
+              <w:spacing w:line="240" w:lineRule="auto"/>
+            </w:pPr>
             <w:r>
               <w:rPr>
-                <w:sz w:val="18"/>
+                <w:rFonts w:ascii="Times New Roman" w:hAnsi="Times New Roman"/>
+                <w:color w:val="000000"/>
+                <w:sz w:val="22"/>
               </w:rPr>
               <w:t>OK</w:t>
             </w:r>
@@ -1988,9 +2794,14 @@
             <w:tcW w:type="dxa" w:w="1728"/>
           </w:tcPr>
           <w:p>
+            <w:pPr>
+              <w:spacing w:line="240" w:lineRule="auto"/>
+            </w:pPr>
             <w:r>
               <w:rPr>
-                <w:sz w:val="18"/>
+                <w:rFonts w:ascii="Times New Roman" w:hAnsi="Times New Roman"/>
+                <w:color w:val="000000"/>
+                <w:sz w:val="22"/>
               </w:rPr>
               <w:t>TablaHash</w:t>
             </w:r>
@@ -2001,9 +2812,14 @@
             <w:tcW w:type="dxa" w:w="1728"/>
           </w:tcPr>
           <w:p>
+            <w:pPr>
+              <w:spacing w:line="240" w:lineRule="auto"/>
+            </w:pPr>
             <w:r>
               <w:rPr>
-                <w:sz w:val="18"/>
+                <w:rFonts w:ascii="Times New Roman" w:hAnsi="Times New Roman"/>
+                <w:color w:val="000000"/>
+                <w:sz w:val="22"/>
               </w:rPr>
               <w:t>test_put_y_get</w:t>
             </w:r>
@@ -2014,9 +2830,14 @@
             <w:tcW w:type="dxa" w:w="1728"/>
           </w:tcPr>
           <w:p>
+            <w:pPr>
+              <w:spacing w:line="240" w:lineRule="auto"/>
+            </w:pPr>
             <w:r>
               <w:rPr>
-                <w:sz w:val="18"/>
+                <w:rFonts w:ascii="Times New Roman" w:hAnsi="Times New Roman"/>
+                <w:color w:val="000000"/>
+                <w:sz w:val="22"/>
               </w:rPr>
               <w:t>put a=1, b=2 y get</w:t>
             </w:r>
@@ -2027,9 +2848,14 @@
             <w:tcW w:type="dxa" w:w="1728"/>
           </w:tcPr>
           <w:p>
+            <w:pPr>
+              <w:spacing w:line="240" w:lineRule="auto"/>
+            </w:pPr>
             <w:r>
               <w:rPr>
-                <w:sz w:val="18"/>
+                <w:rFonts w:ascii="Times New Roman" w:hAnsi="Times New Roman"/>
+                <w:color w:val="000000"/>
+                <w:sz w:val="22"/>
               </w:rPr>
               <w:t>get devuelve 1 y 2, size 2</w:t>
             </w:r>
@@ -2040,9 +2866,14 @@
             <w:tcW w:type="dxa" w:w="1728"/>
           </w:tcPr>
           <w:p>
+            <w:pPr>
+              <w:spacing w:line="240" w:lineRule="auto"/>
+            </w:pPr>
             <w:r>
               <w:rPr>
-                <w:sz w:val="18"/>
+                <w:rFonts w:ascii="Times New Roman" w:hAnsi="Times New Roman"/>
+                <w:color w:val="000000"/>
+                <w:sz w:val="22"/>
               </w:rPr>
               <w:t>OK</w:t>
             </w:r>
@@ -2055,9 +2886,14 @@
             <w:tcW w:type="dxa" w:w="1728"/>
           </w:tcPr>
           <w:p>
+            <w:pPr>
+              <w:spacing w:line="240" w:lineRule="auto"/>
+            </w:pPr>
             <w:r>
               <w:rPr>
-                <w:sz w:val="18"/>
+                <w:rFonts w:ascii="Times New Roman" w:hAnsi="Times New Roman"/>
+                <w:color w:val="000000"/>
+                <w:sz w:val="22"/>
               </w:rPr>
               <w:t>TablaHash</w:t>
             </w:r>
@@ -2068,9 +2904,14 @@
             <w:tcW w:type="dxa" w:w="1728"/>
           </w:tcPr>
           <w:p>
+            <w:pPr>
+              <w:spacing w:line="240" w:lineRule="auto"/>
+            </w:pPr>
             <w:r>
               <w:rPr>
-                <w:sz w:val="18"/>
+                <w:rFonts w:ascii="Times New Roman" w:hAnsi="Times New Roman"/>
+                <w:color w:val="000000"/>
+                <w:sz w:val="22"/>
               </w:rPr>
               <w:t>test_insert_es_igual_que_put</w:t>
             </w:r>
@@ -2081,9 +2922,14 @@
             <w:tcW w:type="dxa" w:w="1728"/>
           </w:tcPr>
           <w:p>
+            <w:pPr>
+              <w:spacing w:line="240" w:lineRule="auto"/>
+            </w:pPr>
             <w:r>
               <w:rPr>
-                <w:sz w:val="18"/>
+                <w:rFonts w:ascii="Times New Roman" w:hAnsi="Times New Roman"/>
+                <w:color w:val="000000"/>
+                <w:sz w:val="22"/>
               </w:rPr>
               <w:t>insert a=1</w:t>
             </w:r>
@@ -2094,9 +2940,14 @@
             <w:tcW w:type="dxa" w:w="1728"/>
           </w:tcPr>
           <w:p>
+            <w:pPr>
+              <w:spacing w:line="240" w:lineRule="auto"/>
+            </w:pPr>
             <w:r>
               <w:rPr>
-                <w:sz w:val="18"/>
+                <w:rFonts w:ascii="Times New Roman" w:hAnsi="Times New Roman"/>
+                <w:color w:val="000000"/>
+                <w:sz w:val="22"/>
               </w:rPr>
               <w:t>t['a'] es 1</w:t>
             </w:r>
@@ -2107,9 +2958,14 @@
             <w:tcW w:type="dxa" w:w="1728"/>
           </w:tcPr>
           <w:p>
+            <w:pPr>
+              <w:spacing w:line="240" w:lineRule="auto"/>
+            </w:pPr>
             <w:r>
               <w:rPr>
-                <w:sz w:val="18"/>
+                <w:rFonts w:ascii="Times New Roman" w:hAnsi="Times New Roman"/>
+                <w:color w:val="000000"/>
+                <w:sz w:val="22"/>
               </w:rPr>
               <w:t>OK</w:t>
             </w:r>
@@ -2122,9 +2978,14 @@
             <w:tcW w:type="dxa" w:w="1728"/>
           </w:tcPr>
           <w:p>
+            <w:pPr>
+              <w:spacing w:line="240" w:lineRule="auto"/>
+            </w:pPr>
             <w:r>
               <w:rPr>
-                <w:sz w:val="18"/>
+                <w:rFonts w:ascii="Times New Roman" w:hAnsi="Times New Roman"/>
+                <w:color w:val="000000"/>
+                <w:sz w:val="22"/>
               </w:rPr>
               <w:t>TablaHash</w:t>
             </w:r>
@@ -2135,9 +2996,14 @@
             <w:tcW w:type="dxa" w:w="1728"/>
           </w:tcPr>
           <w:p>
+            <w:pPr>
+              <w:spacing w:line="240" w:lineRule="auto"/>
+            </w:pPr>
             <w:r>
               <w:rPr>
-                <w:sz w:val="18"/>
+                <w:rFonts w:ascii="Times New Roman" w:hAnsi="Times New Roman"/>
+                <w:color w:val="000000"/>
+                <w:sz w:val="22"/>
               </w:rPr>
               <w:t>test_get_con_default</w:t>
             </w:r>
@@ -2148,9 +3014,14 @@
             <w:tcW w:type="dxa" w:w="1728"/>
           </w:tcPr>
           <w:p>
+            <w:pPr>
+              <w:spacing w:line="240" w:lineRule="auto"/>
+            </w:pPr>
             <w:r>
               <w:rPr>
-                <w:sz w:val="18"/>
+                <w:rFonts w:ascii="Times New Roman" w:hAnsi="Times New Roman"/>
+                <w:color w:val="000000"/>
+                <w:sz w:val="22"/>
               </w:rPr>
               <w:t>get de llave inexistente, sin y con default</w:t>
             </w:r>
@@ -2161,9 +3032,14 @@
             <w:tcW w:type="dxa" w:w="1728"/>
           </w:tcPr>
           <w:p>
+            <w:pPr>
+              <w:spacing w:line="240" w:lineRule="auto"/>
+            </w:pPr>
             <w:r>
               <w:rPr>
-                <w:sz w:val="18"/>
+                <w:rFonts w:ascii="Times New Roman" w:hAnsi="Times New Roman"/>
+                <w:color w:val="000000"/>
+                <w:sz w:val="22"/>
               </w:rPr>
               <w:t>None y 42</w:t>
             </w:r>
@@ -2174,9 +3050,14 @@
             <w:tcW w:type="dxa" w:w="1728"/>
           </w:tcPr>
           <w:p>
+            <w:pPr>
+              <w:spacing w:line="240" w:lineRule="auto"/>
+            </w:pPr>
             <w:r>
               <w:rPr>
-                <w:sz w:val="18"/>
+                <w:rFonts w:ascii="Times New Roman" w:hAnsi="Times New Roman"/>
+                <w:color w:val="000000"/>
+                <w:sz w:val="22"/>
               </w:rPr>
               <w:t>OK</w:t>
             </w:r>
@@ -2189,9 +3070,14 @@
             <w:tcW w:type="dxa" w:w="1728"/>
           </w:tcPr>
           <w:p>
+            <w:pPr>
+              <w:spacing w:line="240" w:lineRule="auto"/>
+            </w:pPr>
             <w:r>
               <w:rPr>
-                <w:sz w:val="18"/>
+                <w:rFonts w:ascii="Times New Roman" w:hAnsi="Times New Roman"/>
+                <w:color w:val="000000"/>
+                <w:sz w:val="22"/>
               </w:rPr>
               <w:t>TablaHash</w:t>
             </w:r>
@@ -2202,9 +3088,14 @@
             <w:tcW w:type="dxa" w:w="1728"/>
           </w:tcPr>
           <w:p>
+            <w:pPr>
+              <w:spacing w:line="240" w:lineRule="auto"/>
+            </w:pPr>
             <w:r>
               <w:rPr>
-                <w:sz w:val="18"/>
+                <w:rFonts w:ascii="Times New Roman" w:hAnsi="Times New Roman"/>
+                <w:color w:val="000000"/>
+                <w:sz w:val="22"/>
               </w:rPr>
               <w:t>test_getitem_llave_inexistente</w:t>
             </w:r>
@@ -2215,9 +3106,14 @@
             <w:tcW w:type="dxa" w:w="1728"/>
           </w:tcPr>
           <w:p>
+            <w:pPr>
+              <w:spacing w:line="240" w:lineRule="auto"/>
+            </w:pPr>
             <w:r>
               <w:rPr>
-                <w:sz w:val="18"/>
+                <w:rFonts w:ascii="Times New Roman" w:hAnsi="Times New Roman"/>
+                <w:color w:val="000000"/>
+                <w:sz w:val="22"/>
               </w:rPr>
               <w:t>t['nada'] sobre tabla vacia</w:t>
             </w:r>
@@ -2228,9 +3124,14 @@
             <w:tcW w:type="dxa" w:w="1728"/>
           </w:tcPr>
           <w:p>
+            <w:pPr>
+              <w:spacing w:line="240" w:lineRule="auto"/>
+            </w:pPr>
             <w:r>
               <w:rPr>
-                <w:sz w:val="18"/>
+                <w:rFonts w:ascii="Times New Roman" w:hAnsi="Times New Roman"/>
+                <w:color w:val="000000"/>
+                <w:sz w:val="22"/>
               </w:rPr>
               <w:t>KeyError</w:t>
             </w:r>
@@ -2241,9 +3142,14 @@
             <w:tcW w:type="dxa" w:w="1728"/>
           </w:tcPr>
           <w:p>
+            <w:pPr>
+              <w:spacing w:line="240" w:lineRule="auto"/>
+            </w:pPr>
             <w:r>
               <w:rPr>
-                <w:sz w:val="18"/>
+                <w:rFonts w:ascii="Times New Roman" w:hAnsi="Times New Roman"/>
+                <w:color w:val="000000"/>
+                <w:sz w:val="22"/>
               </w:rPr>
               <w:t>OK</w:t>
             </w:r>
@@ -2256,9 +3162,14 @@
             <w:tcW w:type="dxa" w:w="1728"/>
           </w:tcPr>
           <w:p>
+            <w:pPr>
+              <w:spacing w:line="240" w:lineRule="auto"/>
+            </w:pPr>
             <w:r>
               <w:rPr>
-                <w:sz w:val="18"/>
+                <w:rFonts w:ascii="Times New Roman" w:hAnsi="Times New Roman"/>
+                <w:color w:val="000000"/>
+                <w:sz w:val="22"/>
               </w:rPr>
               <w:t>TablaHash</w:t>
             </w:r>
@@ -2269,9 +3180,14 @@
             <w:tcW w:type="dxa" w:w="1728"/>
           </w:tcPr>
           <w:p>
+            <w:pPr>
+              <w:spacing w:line="240" w:lineRule="auto"/>
+            </w:pPr>
             <w:r>
               <w:rPr>
-                <w:sz w:val="18"/>
+                <w:rFonts w:ascii="Times New Roman" w:hAnsi="Times New Roman"/>
+                <w:color w:val="000000"/>
+                <w:sz w:val="22"/>
               </w:rPr>
               <w:t>test_sobrescribir_llave</w:t>
             </w:r>
@@ -2282,9 +3198,14 @@
             <w:tcW w:type="dxa" w:w="1728"/>
           </w:tcPr>
           <w:p>
+            <w:pPr>
+              <w:spacing w:line="240" w:lineRule="auto"/>
+            </w:pPr>
             <w:r>
               <w:rPr>
-                <w:sz w:val="18"/>
+                <w:rFonts w:ascii="Times New Roman" w:hAnsi="Times New Roman"/>
+                <w:color w:val="000000"/>
+                <w:sz w:val="22"/>
               </w:rPr>
               <w:t>put a=1 y luego a=2</w:t>
             </w:r>
@@ -2295,9 +3216,14 @@
             <w:tcW w:type="dxa" w:w="1728"/>
           </w:tcPr>
           <w:p>
+            <w:pPr>
+              <w:spacing w:line="240" w:lineRule="auto"/>
+            </w:pPr>
             <w:r>
               <w:rPr>
-                <w:sz w:val="18"/>
+                <w:rFonts w:ascii="Times New Roman" w:hAnsi="Times New Roman"/>
+                <w:color w:val="000000"/>
+                <w:sz w:val="22"/>
               </w:rPr>
               <w:t>get es 2, len 1, keys ['a']</w:t>
             </w:r>
@@ -2308,9 +3234,14 @@
             <w:tcW w:type="dxa" w:w="1728"/>
           </w:tcPr>
           <w:p>
+            <w:pPr>
+              <w:spacing w:line="240" w:lineRule="auto"/>
+            </w:pPr>
             <w:r>
               <w:rPr>
-                <w:sz w:val="18"/>
+                <w:rFonts w:ascii="Times New Roman" w:hAnsi="Times New Roman"/>
+                <w:color w:val="000000"/>
+                <w:sz w:val="22"/>
               </w:rPr>
               <w:t>OK</w:t>
             </w:r>
@@ -2323,9 +3254,14 @@
             <w:tcW w:type="dxa" w:w="1728"/>
           </w:tcPr>
           <w:p>
+            <w:pPr>
+              <w:spacing w:line="240" w:lineRule="auto"/>
+            </w:pPr>
             <w:r>
               <w:rPr>
-                <w:sz w:val="18"/>
+                <w:rFonts w:ascii="Times New Roman" w:hAnsi="Times New Roman"/>
+                <w:color w:val="000000"/>
+                <w:sz w:val="22"/>
               </w:rPr>
               <w:t>TablaHash</w:t>
             </w:r>
@@ -2336,9 +3272,14 @@
             <w:tcW w:type="dxa" w:w="1728"/>
           </w:tcPr>
           <w:p>
+            <w:pPr>
+              <w:spacing w:line="240" w:lineRule="auto"/>
+            </w:pPr>
             <w:r>
               <w:rPr>
-                <w:sz w:val="18"/>
+                <w:rFonts w:ascii="Times New Roman" w:hAnsi="Times New Roman"/>
+                <w:color w:val="000000"/>
+                <w:sz w:val="22"/>
               </w:rPr>
               <w:t>test_remove_regresa_valor</w:t>
             </w:r>
@@ -2349,9 +3290,14 @@
             <w:tcW w:type="dxa" w:w="1728"/>
           </w:tcPr>
           <w:p>
+            <w:pPr>
+              <w:spacing w:line="240" w:lineRule="auto"/>
+            </w:pPr>
             <w:r>
               <w:rPr>
-                <w:sz w:val="18"/>
+                <w:rFonts w:ascii="Times New Roman" w:hAnsi="Times New Roman"/>
+                <w:color w:val="000000"/>
+                <w:sz w:val="22"/>
               </w:rPr>
               <w:t>put a=1 y remove a</w:t>
             </w:r>
@@ -2362,9 +3308,14 @@
             <w:tcW w:type="dxa" w:w="1728"/>
           </w:tcPr>
           <w:p>
+            <w:pPr>
+              <w:spacing w:line="240" w:lineRule="auto"/>
+            </w:pPr>
             <w:r>
               <w:rPr>
-                <w:sz w:val="18"/>
+                <w:rFonts w:ascii="Times New Roman" w:hAnsi="Times New Roman"/>
+                <w:color w:val="000000"/>
+                <w:sz w:val="22"/>
               </w:rPr>
               <w:t>regresa 1, a ya no esta, len 0</w:t>
             </w:r>
@@ -2375,9 +3326,14 @@
             <w:tcW w:type="dxa" w:w="1728"/>
           </w:tcPr>
           <w:p>
+            <w:pPr>
+              <w:spacing w:line="240" w:lineRule="auto"/>
+            </w:pPr>
             <w:r>
               <w:rPr>
-                <w:sz w:val="18"/>
+                <w:rFonts w:ascii="Times New Roman" w:hAnsi="Times New Roman"/>
+                <w:color w:val="000000"/>
+                <w:sz w:val="22"/>
               </w:rPr>
               <w:t>OK</w:t>
             </w:r>
@@ -2390,9 +3346,14 @@
             <w:tcW w:type="dxa" w:w="1728"/>
           </w:tcPr>
           <w:p>
+            <w:pPr>
+              <w:spacing w:line="240" w:lineRule="auto"/>
+            </w:pPr>
             <w:r>
               <w:rPr>
-                <w:sz w:val="18"/>
+                <w:rFonts w:ascii="Times New Roman" w:hAnsi="Times New Roman"/>
+                <w:color w:val="000000"/>
+                <w:sz w:val="22"/>
               </w:rPr>
               <w:t>TablaHash</w:t>
             </w:r>
@@ -2403,9 +3364,14 @@
             <w:tcW w:type="dxa" w:w="1728"/>
           </w:tcPr>
           <w:p>
+            <w:pPr>
+              <w:spacing w:line="240" w:lineRule="auto"/>
+            </w:pPr>
             <w:r>
               <w:rPr>
-                <w:sz w:val="18"/>
+                <w:rFonts w:ascii="Times New Roman" w:hAnsi="Times New Roman"/>
+                <w:color w:val="000000"/>
+                <w:sz w:val="22"/>
               </w:rPr>
               <w:t>test_remove_llave_inexistente</w:t>
             </w:r>
@@ -2416,9 +3382,14 @@
             <w:tcW w:type="dxa" w:w="1728"/>
           </w:tcPr>
           <w:p>
+            <w:pPr>
+              <w:spacing w:line="240" w:lineRule="auto"/>
+            </w:pPr>
             <w:r>
               <w:rPr>
-                <w:sz w:val="18"/>
+                <w:rFonts w:ascii="Times New Roman" w:hAnsi="Times New Roman"/>
+                <w:color w:val="000000"/>
+                <w:sz w:val="22"/>
               </w:rPr>
               <w:t>remove de llave que no existe</w:t>
             </w:r>
@@ -2429,9 +3400,14 @@
             <w:tcW w:type="dxa" w:w="1728"/>
           </w:tcPr>
           <w:p>
+            <w:pPr>
+              <w:spacing w:line="240" w:lineRule="auto"/>
+            </w:pPr>
             <w:r>
               <w:rPr>
-                <w:sz w:val="18"/>
+                <w:rFonts w:ascii="Times New Roman" w:hAnsi="Times New Roman"/>
+                <w:color w:val="000000"/>
+                <w:sz w:val="22"/>
               </w:rPr>
               <w:t>KeyError</w:t>
             </w:r>
@@ -2442,9 +3418,14 @@
             <w:tcW w:type="dxa" w:w="1728"/>
           </w:tcPr>
           <w:p>
+            <w:pPr>
+              <w:spacing w:line="240" w:lineRule="auto"/>
+            </w:pPr>
             <w:r>
               <w:rPr>
-                <w:sz w:val="18"/>
+                <w:rFonts w:ascii="Times New Roman" w:hAnsi="Times New Roman"/>
+                <w:color w:val="000000"/>
+                <w:sz w:val="22"/>
               </w:rPr>
               <w:t>OK</w:t>
             </w:r>
@@ -2457,9 +3438,14 @@
             <w:tcW w:type="dxa" w:w="1728"/>
           </w:tcPr>
           <w:p>
+            <w:pPr>
+              <w:spacing w:line="240" w:lineRule="auto"/>
+            </w:pPr>
             <w:r>
               <w:rPr>
-                <w:sz w:val="18"/>
+                <w:rFonts w:ascii="Times New Roman" w:hAnsi="Times New Roman"/>
+                <w:color w:val="000000"/>
+                <w:sz w:val="22"/>
               </w:rPr>
               <w:t>TablaHash</w:t>
             </w:r>
@@ -2470,9 +3456,14 @@
             <w:tcW w:type="dxa" w:w="1728"/>
           </w:tcPr>
           <w:p>
+            <w:pPr>
+              <w:spacing w:line="240" w:lineRule="auto"/>
+            </w:pPr>
             <w:r>
               <w:rPr>
-                <w:sz w:val="18"/>
+                <w:rFonts w:ascii="Times New Roman" w:hAnsi="Times New Roman"/>
+                <w:color w:val="000000"/>
+                <w:sz w:val="22"/>
               </w:rPr>
               <w:t>test_delete_y_delitem</w:t>
             </w:r>
@@ -2483,9 +3474,14 @@
             <w:tcW w:type="dxa" w:w="1728"/>
           </w:tcPr>
           <w:p>
+            <w:pPr>
+              <w:spacing w:line="240" w:lineRule="auto"/>
+            </w:pPr>
             <w:r>
               <w:rPr>
-                <w:sz w:val="18"/>
+                <w:rFonts w:ascii="Times New Roman" w:hAnsi="Times New Roman"/>
+                <w:color w:val="000000"/>
+                <w:sz w:val="22"/>
               </w:rPr>
               <w:t>delete('a') y del t['b']</w:t>
             </w:r>
@@ -2496,9 +3492,14 @@
             <w:tcW w:type="dxa" w:w="1728"/>
           </w:tcPr>
           <w:p>
+            <w:pPr>
+              <w:spacing w:line="240" w:lineRule="auto"/>
+            </w:pPr>
             <w:r>
               <w:rPr>
-                <w:sz w:val="18"/>
+                <w:rFonts w:ascii="Times New Roman" w:hAnsi="Times New Roman"/>
+                <w:color w:val="000000"/>
+                <w:sz w:val="22"/>
               </w:rPr>
               <w:t>la tabla queda vacia</w:t>
             </w:r>
@@ -2509,9 +3510,14 @@
             <w:tcW w:type="dxa" w:w="1728"/>
           </w:tcPr>
           <w:p>
+            <w:pPr>
+              <w:spacing w:line="240" w:lineRule="auto"/>
+            </w:pPr>
             <w:r>
               <w:rPr>
-                <w:sz w:val="18"/>
+                <w:rFonts w:ascii="Times New Roman" w:hAnsi="Times New Roman"/>
+                <w:color w:val="000000"/>
+                <w:sz w:val="22"/>
               </w:rPr>
               <w:t>OK</w:t>
             </w:r>
@@ -2524,9 +3530,14 @@
             <w:tcW w:type="dxa" w:w="1728"/>
           </w:tcPr>
           <w:p>
+            <w:pPr>
+              <w:spacing w:line="240" w:lineRule="auto"/>
+            </w:pPr>
             <w:r>
               <w:rPr>
-                <w:sz w:val="18"/>
+                <w:rFonts w:ascii="Times New Roman" w:hAnsi="Times New Roman"/>
+                <w:color w:val="000000"/>
+                <w:sz w:val="22"/>
               </w:rPr>
               <w:t>TablaHash</w:t>
             </w:r>
@@ -2537,9 +3548,14 @@
             <w:tcW w:type="dxa" w:w="1728"/>
           </w:tcPr>
           <w:p>
+            <w:pPr>
+              <w:spacing w:line="240" w:lineRule="auto"/>
+            </w:pPr>
             <w:r>
               <w:rPr>
-                <w:sz w:val="18"/>
+                <w:rFonts w:ascii="Times New Roman" w:hAnsi="Times New Roman"/>
+                <w:color w:val="000000"/>
+                <w:sz w:val="22"/>
               </w:rPr>
               <w:t>test_borrar_y_reinsertar</w:t>
             </w:r>
@@ -2550,9 +3566,14 @@
             <w:tcW w:type="dxa" w:w="1728"/>
           </w:tcPr>
           <w:p>
+            <w:pPr>
+              <w:spacing w:line="240" w:lineRule="auto"/>
+            </w:pPr>
             <w:r>
               <w:rPr>
-                <w:sz w:val="18"/>
+                <w:rFonts w:ascii="Times New Roman" w:hAnsi="Times New Roman"/>
+                <w:color w:val="000000"/>
+                <w:sz w:val="22"/>
               </w:rPr>
               <w:t>put a, b; remove a; put a=3</w:t>
             </w:r>
@@ -2563,9 +3584,14 @@
             <w:tcW w:type="dxa" w:w="1728"/>
           </w:tcPr>
           <w:p>
+            <w:pPr>
+              <w:spacing w:line="240" w:lineRule="auto"/>
+            </w:pPr>
             <w:r>
               <w:rPr>
-                <w:sz w:val="18"/>
+                <w:rFonts w:ascii="Times New Roman" w:hAnsi="Times New Roman"/>
+                <w:color w:val="000000"/>
+                <w:sz w:val="22"/>
               </w:rPr>
               <w:t>get a es 3 y keys ['b', 'a']</w:t>
             </w:r>
@@ -2576,9 +3602,14 @@
             <w:tcW w:type="dxa" w:w="1728"/>
           </w:tcPr>
           <w:p>
+            <w:pPr>
+              <w:spacing w:line="240" w:lineRule="auto"/>
+            </w:pPr>
             <w:r>
               <w:rPr>
-                <w:sz w:val="18"/>
+                <w:rFonts w:ascii="Times New Roman" w:hAnsi="Times New Roman"/>
+                <w:color w:val="000000"/>
+                <w:sz w:val="22"/>
               </w:rPr>
               <w:t>OK</w:t>
             </w:r>
@@ -2591,9 +3622,14 @@
             <w:tcW w:type="dxa" w:w="1728"/>
           </w:tcPr>
           <w:p>
+            <w:pPr>
+              <w:spacing w:line="240" w:lineRule="auto"/>
+            </w:pPr>
             <w:r>
               <w:rPr>
-                <w:sz w:val="18"/>
+                <w:rFonts w:ascii="Times New Roman" w:hAnsi="Times New Roman"/>
+                <w:color w:val="000000"/>
+                <w:sz w:val="22"/>
               </w:rPr>
               <w:t>TablaHash</w:t>
             </w:r>
@@ -2604,9 +3640,14 @@
             <w:tcW w:type="dxa" w:w="1728"/>
           </w:tcPr>
           <w:p>
+            <w:pPr>
+              <w:spacing w:line="240" w:lineRule="auto"/>
+            </w:pPr>
             <w:r>
               <w:rPr>
-                <w:sz w:val="18"/>
+                <w:rFonts w:ascii="Times New Roman" w:hAnsi="Times New Roman"/>
+                <w:color w:val="000000"/>
+                <w:sz w:val="22"/>
               </w:rPr>
               <w:t>test_contains</w:t>
             </w:r>
@@ -2617,9 +3658,14 @@
             <w:tcW w:type="dxa" w:w="1728"/>
           </w:tcPr>
           <w:p>
+            <w:pPr>
+              <w:spacing w:line="240" w:lineRule="auto"/>
+            </w:pPr>
             <w:r>
               <w:rPr>
-                <w:sz w:val="18"/>
+                <w:rFonts w:ascii="Times New Roman" w:hAnsi="Times New Roman"/>
+                <w:color w:val="000000"/>
+                <w:sz w:val="22"/>
               </w:rPr>
               <w:t>put a=None; contains, in y not in</w:t>
             </w:r>
@@ -2630,9 +3676,14 @@
             <w:tcW w:type="dxa" w:w="1728"/>
           </w:tcPr>
           <w:p>
+            <w:pPr>
+              <w:spacing w:line="240" w:lineRule="auto"/>
+            </w:pPr>
             <w:r>
               <w:rPr>
-                <w:sz w:val="18"/>
+                <w:rFonts w:ascii="Times New Roman" w:hAnsi="Times New Roman"/>
+                <w:color w:val="000000"/>
+                <w:sz w:val="22"/>
               </w:rPr>
               <w:t>a esta (aunque su valor sea None), b no</w:t>
             </w:r>
@@ -2643,9 +3694,14 @@
             <w:tcW w:type="dxa" w:w="1728"/>
           </w:tcPr>
           <w:p>
+            <w:pPr>
+              <w:spacing w:line="240" w:lineRule="auto"/>
+            </w:pPr>
             <w:r>
               <w:rPr>
-                <w:sz w:val="18"/>
+                <w:rFonts w:ascii="Times New Roman" w:hAnsi="Times New Roman"/>
+                <w:color w:val="000000"/>
+                <w:sz w:val="22"/>
               </w:rPr>
               <w:t>OK</w:t>
             </w:r>
@@ -2658,9 +3714,14 @@
             <w:tcW w:type="dxa" w:w="1728"/>
           </w:tcPr>
           <w:p>
+            <w:pPr>
+              <w:spacing w:line="240" w:lineRule="auto"/>
+            </w:pPr>
             <w:r>
               <w:rPr>
-                <w:sz w:val="18"/>
+                <w:rFonts w:ascii="Times New Roman" w:hAnsi="Times New Roman"/>
+                <w:color w:val="000000"/>
+                <w:sz w:val="22"/>
               </w:rPr>
               <w:t>TablaHash</w:t>
             </w:r>
@@ -2671,9 +3732,14 @@
             <w:tcW w:type="dxa" w:w="1728"/>
           </w:tcPr>
           <w:p>
+            <w:pPr>
+              <w:spacing w:line="240" w:lineRule="auto"/>
+            </w:pPr>
             <w:r>
               <w:rPr>
-                <w:sz w:val="18"/>
+                <w:rFonts w:ascii="Times New Roman" w:hAnsi="Times New Roman"/>
+                <w:color w:val="000000"/>
+                <w:sz w:val="22"/>
               </w:rPr>
               <w:t>test_setitem_getitem</w:t>
             </w:r>
@@ -2684,9 +3750,14 @@
             <w:tcW w:type="dxa" w:w="1728"/>
           </w:tcPr>
           <w:p>
+            <w:pPr>
+              <w:spacing w:line="240" w:lineRule="auto"/>
+            </w:pPr>
             <w:r>
               <w:rPr>
-                <w:sz w:val="18"/>
+                <w:rFonts w:ascii="Times New Roman" w:hAnsi="Times New Roman"/>
+                <w:color w:val="000000"/>
+                <w:sz w:val="22"/>
               </w:rPr>
               <w:t>t['x'] = 10 y t['x']</w:t>
             </w:r>
@@ -2697,9 +3768,14 @@
             <w:tcW w:type="dxa" w:w="1728"/>
           </w:tcPr>
           <w:p>
+            <w:pPr>
+              <w:spacing w:line="240" w:lineRule="auto"/>
+            </w:pPr>
             <w:r>
               <w:rPr>
-                <w:sz w:val="18"/>
+                <w:rFonts w:ascii="Times New Roman" w:hAnsi="Times New Roman"/>
+                <w:color w:val="000000"/>
+                <w:sz w:val="22"/>
               </w:rPr>
               <w:t>10</w:t>
             </w:r>
@@ -2710,9 +3786,14 @@
             <w:tcW w:type="dxa" w:w="1728"/>
           </w:tcPr>
           <w:p>
+            <w:pPr>
+              <w:spacing w:line="240" w:lineRule="auto"/>
+            </w:pPr>
             <w:r>
               <w:rPr>
-                <w:sz w:val="18"/>
+                <w:rFonts w:ascii="Times New Roman" w:hAnsi="Times New Roman"/>
+                <w:color w:val="000000"/>
+                <w:sz w:val="22"/>
               </w:rPr>
               <w:t>OK</w:t>
             </w:r>
@@ -2725,9 +3806,14 @@
             <w:tcW w:type="dxa" w:w="1728"/>
           </w:tcPr>
           <w:p>
+            <w:pPr>
+              <w:spacing w:line="240" w:lineRule="auto"/>
+            </w:pPr>
             <w:r>
               <w:rPr>
-                <w:sz w:val="18"/>
+                <w:rFonts w:ascii="Times New Roman" w:hAnsi="Times New Roman"/>
+                <w:color w:val="000000"/>
+                <w:sz w:val="22"/>
               </w:rPr>
               <w:t>TablaHash</w:t>
             </w:r>
@@ -2738,9 +3824,14 @@
             <w:tcW w:type="dxa" w:w="1728"/>
           </w:tcPr>
           <w:p>
+            <w:pPr>
+              <w:spacing w:line="240" w:lineRule="auto"/>
+            </w:pPr>
             <w:r>
               <w:rPr>
-                <w:sz w:val="18"/>
+                <w:rFonts w:ascii="Times New Roman" w:hAnsi="Times New Roman"/>
+                <w:color w:val="000000"/>
+                <w:sz w:val="22"/>
               </w:rPr>
               <w:t>test_orden_de_insercion</w:t>
             </w:r>
@@ -2751,9 +3842,14 @@
             <w:tcW w:type="dxa" w:w="1728"/>
           </w:tcPr>
           <w:p>
+            <w:pPr>
+              <w:spacing w:line="240" w:lineRule="auto"/>
+            </w:pPr>
             <w:r>
               <w:rPr>
-                <w:sz w:val="18"/>
+                <w:rFonts w:ascii="Times New Roman" w:hAnsi="Times New Roman"/>
+                <w:color w:val="000000"/>
+                <w:sz w:val="22"/>
               </w:rPr>
               <w:t>put z, a, m, b, y; keys, values, items</w:t>
             </w:r>
@@ -2764,9 +3860,14 @@
             <w:tcW w:type="dxa" w:w="1728"/>
           </w:tcPr>
           <w:p>
+            <w:pPr>
+              <w:spacing w:line="240" w:lineRule="auto"/>
+            </w:pPr>
             <w:r>
               <w:rPr>
-                <w:sz w:val="18"/>
+                <w:rFonts w:ascii="Times New Roman" w:hAnsi="Times New Roman"/>
+                <w:color w:val="000000"/>
+                <w:sz w:val="22"/>
               </w:rPr>
               <w:t>mismo orden en que se insertaron</w:t>
             </w:r>
@@ -2777,9 +3878,14 @@
             <w:tcW w:type="dxa" w:w="1728"/>
           </w:tcPr>
           <w:p>
+            <w:pPr>
+              <w:spacing w:line="240" w:lineRule="auto"/>
+            </w:pPr>
             <w:r>
               <w:rPr>
-                <w:sz w:val="18"/>
+                <w:rFonts w:ascii="Times New Roman" w:hAnsi="Times New Roman"/>
+                <w:color w:val="000000"/>
+                <w:sz w:val="22"/>
               </w:rPr>
               <w:t>OK</w:t>
             </w:r>
@@ -2792,9 +3898,14 @@
             <w:tcW w:type="dxa" w:w="1728"/>
           </w:tcPr>
           <w:p>
+            <w:pPr>
+              <w:spacing w:line="240" w:lineRule="auto"/>
+            </w:pPr>
             <w:r>
               <w:rPr>
-                <w:sz w:val="18"/>
+                <w:rFonts w:ascii="Times New Roman" w:hAnsi="Times New Roman"/>
+                <w:color w:val="000000"/>
+                <w:sz w:val="22"/>
               </w:rPr>
               <w:t>TablaHash</w:t>
             </w:r>
@@ -2805,9 +3916,14 @@
             <w:tcW w:type="dxa" w:w="1728"/>
           </w:tcPr>
           <w:p>
+            <w:pPr>
+              <w:spacing w:line="240" w:lineRule="auto"/>
+            </w:pPr>
             <w:r>
               <w:rPr>
-                <w:sz w:val="18"/>
+                <w:rFonts w:ascii="Times New Roman" w:hAnsi="Times New Roman"/>
+                <w:color w:val="000000"/>
+                <w:sz w:val="22"/>
               </w:rPr>
               <w:t>test_sobrescribir_no_cambia_el_orden</w:t>
             </w:r>
@@ -2818,9 +3934,14 @@
             <w:tcW w:type="dxa" w:w="1728"/>
           </w:tcPr>
           <w:p>
+            <w:pPr>
+              <w:spacing w:line="240" w:lineRule="auto"/>
+            </w:pPr>
             <w:r>
               <w:rPr>
-                <w:sz w:val="18"/>
+                <w:rFonts w:ascii="Times New Roman" w:hAnsi="Times New Roman"/>
+                <w:color w:val="000000"/>
+                <w:sz w:val="22"/>
               </w:rPr>
               <w:t>put a, b y luego a=99</w:t>
             </w:r>
@@ -2831,9 +3952,14 @@
             <w:tcW w:type="dxa" w:w="1728"/>
           </w:tcPr>
           <w:p>
+            <w:pPr>
+              <w:spacing w:line="240" w:lineRule="auto"/>
+            </w:pPr>
             <w:r>
               <w:rPr>
-                <w:sz w:val="18"/>
+                <w:rFonts w:ascii="Times New Roman" w:hAnsi="Times New Roman"/>
+                <w:color w:val="000000"/>
+                <w:sz w:val="22"/>
               </w:rPr>
               <w:t>keys ['a', 'b']</w:t>
             </w:r>
@@ -2844,9 +3970,14 @@
             <w:tcW w:type="dxa" w:w="1728"/>
           </w:tcPr>
           <w:p>
+            <w:pPr>
+              <w:spacing w:line="240" w:lineRule="auto"/>
+            </w:pPr>
             <w:r>
               <w:rPr>
-                <w:sz w:val="18"/>
+                <w:rFonts w:ascii="Times New Roman" w:hAnsi="Times New Roman"/>
+                <w:color w:val="000000"/>
+                <w:sz w:val="22"/>
               </w:rPr>
               <w:t>OK</w:t>
             </w:r>
@@ -2859,9 +3990,14 @@
             <w:tcW w:type="dxa" w:w="1728"/>
           </w:tcPr>
           <w:p>
+            <w:pPr>
+              <w:spacing w:line="240" w:lineRule="auto"/>
+            </w:pPr>
             <w:r>
               <w:rPr>
-                <w:sz w:val="18"/>
+                <w:rFonts w:ascii="Times New Roman" w:hAnsi="Times New Roman"/>
+                <w:color w:val="000000"/>
+                <w:sz w:val="22"/>
               </w:rPr>
               <w:t>TablaHash</w:t>
             </w:r>
@@ -2872,9 +4008,14 @@
             <w:tcW w:type="dxa" w:w="1728"/>
           </w:tcPr>
           <w:p>
+            <w:pPr>
+              <w:spacing w:line="240" w:lineRule="auto"/>
+            </w:pPr>
             <w:r>
               <w:rPr>
-                <w:sz w:val="18"/>
+                <w:rFonts w:ascii="Times New Roman" w:hAnsi="Times New Roman"/>
+                <w:color w:val="000000"/>
+                <w:sz w:val="22"/>
               </w:rPr>
               <w:t>test_orden_al_borrar_en_medio</w:t>
             </w:r>
@@ -2885,9 +4026,14 @@
             <w:tcW w:type="dxa" w:w="1728"/>
           </w:tcPr>
           <w:p>
+            <w:pPr>
+              <w:spacing w:line="240" w:lineRule="auto"/>
+            </w:pPr>
             <w:r>
               <w:rPr>
-                <w:sz w:val="18"/>
+                <w:rFonts w:ascii="Times New Roman" w:hAnsi="Times New Roman"/>
+                <w:color w:val="000000"/>
+                <w:sz w:val="22"/>
               </w:rPr>
               <w:t>put a..e; remove c, a, e</w:t>
             </w:r>
@@ -2898,9 +4044,14 @@
             <w:tcW w:type="dxa" w:w="1728"/>
           </w:tcPr>
           <w:p>
+            <w:pPr>
+              <w:spacing w:line="240" w:lineRule="auto"/>
+            </w:pPr>
             <w:r>
               <w:rPr>
-                <w:sz w:val="18"/>
+                <w:rFonts w:ascii="Times New Roman" w:hAnsi="Times New Roman"/>
+                <w:color w:val="000000"/>
+                <w:sz w:val="22"/>
               </w:rPr>
               <w:t>keys ['b', 'd']</w:t>
             </w:r>
@@ -2911,9 +4062,14 @@
             <w:tcW w:type="dxa" w:w="1728"/>
           </w:tcPr>
           <w:p>
+            <w:pPr>
+              <w:spacing w:line="240" w:lineRule="auto"/>
+            </w:pPr>
             <w:r>
               <w:rPr>
-                <w:sz w:val="18"/>
+                <w:rFonts w:ascii="Times New Roman" w:hAnsi="Times New Roman"/>
+                <w:color w:val="000000"/>
+                <w:sz w:val="22"/>
               </w:rPr>
               <w:t>OK</w:t>
             </w:r>
@@ -2926,9 +4082,14 @@
             <w:tcW w:type="dxa" w:w="1728"/>
           </w:tcPr>
           <w:p>
+            <w:pPr>
+              <w:spacing w:line="240" w:lineRule="auto"/>
+            </w:pPr>
             <w:r>
               <w:rPr>
-                <w:sz w:val="18"/>
+                <w:rFonts w:ascii="Times New Roman" w:hAnsi="Times New Roman"/>
+                <w:color w:val="000000"/>
+                <w:sz w:val="22"/>
               </w:rPr>
               <w:t>TablaHash</w:t>
             </w:r>
@@ -2939,9 +4100,14 @@
             <w:tcW w:type="dxa" w:w="1728"/>
           </w:tcPr>
           <w:p>
+            <w:pPr>
+              <w:spacing w:line="240" w:lineRule="auto"/>
+            </w:pPr>
             <w:r>
               <w:rPr>
-                <w:sz w:val="18"/>
+                <w:rFonts w:ascii="Times New Roman" w:hAnsi="Times New Roman"/>
+                <w:color w:val="000000"/>
+                <w:sz w:val="22"/>
               </w:rPr>
               <w:t>test_iteracion</w:t>
             </w:r>
@@ -2952,9 +4118,14 @@
             <w:tcW w:type="dxa" w:w="1728"/>
           </w:tcPr>
           <w:p>
+            <w:pPr>
+              <w:spacing w:line="240" w:lineRule="auto"/>
+            </w:pPr>
             <w:r>
               <w:rPr>
-                <w:sz w:val="18"/>
+                <w:rFonts w:ascii="Times New Roman" w:hAnsi="Times New Roman"/>
+                <w:color w:val="000000"/>
+                <w:sz w:val="22"/>
               </w:rPr>
               <w:t>put uno, dos, tres y list(t)</w:t>
             </w:r>
@@ -2965,9 +4136,14 @@
             <w:tcW w:type="dxa" w:w="1728"/>
           </w:tcPr>
           <w:p>
+            <w:pPr>
+              <w:spacing w:line="240" w:lineRule="auto"/>
+            </w:pPr>
             <w:r>
               <w:rPr>
-                <w:sz w:val="18"/>
+                <w:rFonts w:ascii="Times New Roman" w:hAnsi="Times New Roman"/>
+                <w:color w:val="000000"/>
+                <w:sz w:val="22"/>
               </w:rPr>
               <w:t>['uno', 'dos', 'tres']</w:t>
             </w:r>
@@ -2978,9 +4154,14 @@
             <w:tcW w:type="dxa" w:w="1728"/>
           </w:tcPr>
           <w:p>
+            <w:pPr>
+              <w:spacing w:line="240" w:lineRule="auto"/>
+            </w:pPr>
             <w:r>
               <w:rPr>
-                <w:sz w:val="18"/>
+                <w:rFonts w:ascii="Times New Roman" w:hAnsi="Times New Roman"/>
+                <w:color w:val="000000"/>
+                <w:sz w:val="22"/>
               </w:rPr>
               <w:t>OK</w:t>
             </w:r>
@@ -2993,9 +4174,14 @@
             <w:tcW w:type="dxa" w:w="1728"/>
           </w:tcPr>
           <w:p>
+            <w:pPr>
+              <w:spacing w:line="240" w:lineRule="auto"/>
+            </w:pPr>
             <w:r>
               <w:rPr>
-                <w:sz w:val="18"/>
+                <w:rFonts w:ascii="Times New Roman" w:hAnsi="Times New Roman"/>
+                <w:color w:val="000000"/>
+                <w:sz w:val="22"/>
               </w:rPr>
               <w:t>TablaHash</w:t>
             </w:r>
@@ -3006,9 +4192,14 @@
             <w:tcW w:type="dxa" w:w="1728"/>
           </w:tcPr>
           <w:p>
+            <w:pPr>
+              <w:spacing w:line="240" w:lineRule="auto"/>
+            </w:pPr>
             <w:r>
               <w:rPr>
-                <w:sz w:val="18"/>
+                <w:rFonts w:ascii="Times New Roman" w:hAnsi="Times New Roman"/>
+                <w:color w:val="000000"/>
+                <w:sz w:val="22"/>
               </w:rPr>
               <w:t>test_muchos_elementos_con_resize</w:t>
             </w:r>
@@ -3019,9 +4210,14 @@
             <w:tcW w:type="dxa" w:w="1728"/>
           </w:tcPr>
           <w:p>
+            <w:pPr>
+              <w:spacing w:line="240" w:lineRule="auto"/>
+            </w:pPr>
             <w:r>
               <w:rPr>
-                <w:sz w:val="18"/>
+                <w:rFonts w:ascii="Times New Roman" w:hAnsi="Times New Roman"/>
+                <w:color w:val="000000"/>
+                <w:sz w:val="22"/>
               </w:rPr>
               <w:t>1000 put con capacidad inicial 2</w:t>
             </w:r>
@@ -3032,9 +4228,14 @@
             <w:tcW w:type="dxa" w:w="1728"/>
           </w:tcPr>
           <w:p>
+            <w:pPr>
+              <w:spacing w:line="240" w:lineRule="auto"/>
+            </w:pPr>
             <w:r>
               <w:rPr>
-                <w:sz w:val="18"/>
+                <w:rFonts w:ascii="Times New Roman" w:hAnsi="Times New Roman"/>
+                <w:color w:val="000000"/>
+                <w:sz w:val="22"/>
               </w:rPr>
               <w:t>todos recuperables, factor de carga &lt;= 0.75, mas cubetas, orden intacto</w:t>
             </w:r>
@@ -3045,9 +4246,14 @@
             <w:tcW w:type="dxa" w:w="1728"/>
           </w:tcPr>
           <w:p>
+            <w:pPr>
+              <w:spacing w:line="240" w:lineRule="auto"/>
+            </w:pPr>
             <w:r>
               <w:rPr>
-                <w:sz w:val="18"/>
+                <w:rFonts w:ascii="Times New Roman" w:hAnsi="Times New Roman"/>
+                <w:color w:val="000000"/>
+                <w:sz w:val="22"/>
               </w:rPr>
               <w:t>OK</w:t>
             </w:r>
@@ -3060,9 +4266,14 @@
             <w:tcW w:type="dxa" w:w="1728"/>
           </w:tcPr>
           <w:p>
+            <w:pPr>
+              <w:spacing w:line="240" w:lineRule="auto"/>
+            </w:pPr>
             <w:r>
               <w:rPr>
-                <w:sz w:val="18"/>
+                <w:rFonts w:ascii="Times New Roman" w:hAnsi="Times New Roman"/>
+                <w:color w:val="000000"/>
+                <w:sz w:val="22"/>
               </w:rPr>
               <w:t>TablaHash</w:t>
             </w:r>
@@ -3073,9 +4284,14 @@
             <w:tcW w:type="dxa" w:w="1728"/>
           </w:tcPr>
           <w:p>
+            <w:pPr>
+              <w:spacing w:line="240" w:lineRule="auto"/>
+            </w:pPr>
             <w:r>
               <w:rPr>
-                <w:sz w:val="18"/>
+                <w:rFonts w:ascii="Times New Roman" w:hAnsi="Times New Roman"/>
+                <w:color w:val="000000"/>
+                <w:sz w:val="22"/>
               </w:rPr>
               <w:t>test_colisiones_misma_cubeta</w:t>
             </w:r>
@@ -3086,9 +4302,14 @@
             <w:tcW w:type="dxa" w:w="1728"/>
           </w:tcPr>
           <w:p>
+            <w:pPr>
+              <w:spacing w:line="240" w:lineRule="auto"/>
+            </w:pPr>
             <w:r>
               <w:rPr>
-                <w:sz w:val="18"/>
+                <w:rFonts w:ascii="Times New Roman" w:hAnsi="Times New Roman"/>
+                <w:color w:val="000000"/>
+                <w:sz w:val="22"/>
               </w:rPr>
               <w:t>funcion hash constante, 30 llaves, remove y sobrescribir</w:t>
             </w:r>
@@ -3099,9 +4320,14 @@
             <w:tcW w:type="dxa" w:w="1728"/>
           </w:tcPr>
           <w:p>
+            <w:pPr>
+              <w:spacing w:line="240" w:lineRule="auto"/>
+            </w:pPr>
             <w:r>
               <w:rPr>
-                <w:sz w:val="18"/>
+                <w:rFonts w:ascii="Times New Roman" w:hAnsi="Times New Roman"/>
+                <w:color w:val="000000"/>
+                <w:sz w:val="22"/>
               </w:rPr>
               <w:t>todas se encuentran, la borrada no, len 29</w:t>
             </w:r>
@@ -3112,9 +4338,14 @@
             <w:tcW w:type="dxa" w:w="1728"/>
           </w:tcPr>
           <w:p>
+            <w:pPr>
+              <w:spacing w:line="240" w:lineRule="auto"/>
+            </w:pPr>
             <w:r>
               <w:rPr>
-                <w:sz w:val="18"/>
+                <w:rFonts w:ascii="Times New Roman" w:hAnsi="Times New Roman"/>
+                <w:color w:val="000000"/>
+                <w:sz w:val="22"/>
               </w:rPr>
               <w:t>OK</w:t>
             </w:r>
@@ -3127,9 +4358,14 @@
             <w:tcW w:type="dxa" w:w="1728"/>
           </w:tcPr>
           <w:p>
+            <w:pPr>
+              <w:spacing w:line="240" w:lineRule="auto"/>
+            </w:pPr>
             <w:r>
               <w:rPr>
-                <w:sz w:val="18"/>
+                <w:rFonts w:ascii="Times New Roman" w:hAnsi="Times New Roman"/>
+                <w:color w:val="000000"/>
+                <w:sz w:val="22"/>
               </w:rPr>
               <w:t>TablaHash</w:t>
             </w:r>
@@ -3140,9 +4376,14 @@
             <w:tcW w:type="dxa" w:w="1728"/>
           </w:tcPr>
           <w:p>
+            <w:pPr>
+              <w:spacing w:line="240" w:lineRule="auto"/>
+            </w:pPr>
             <w:r>
               <w:rPr>
-                <w:sz w:val="18"/>
+                <w:rFonts w:ascii="Times New Roman" w:hAnsi="Times New Roman"/>
+                <w:color w:val="000000"/>
+                <w:sz w:val="22"/>
               </w:rPr>
               <w:t>test_distintos_tipos_de_llave</w:t>
             </w:r>
@@ -3153,9 +4394,14 @@
             <w:tcW w:type="dxa" w:w="1728"/>
           </w:tcPr>
           <w:p>
+            <w:pPr>
+              <w:spacing w:line="240" w:lineRule="auto"/>
+            </w:pPr>
             <w:r>
               <w:rPr>
-                <w:sz w:val="18"/>
+                <w:rFonts w:ascii="Times New Roman" w:hAnsi="Times New Roman"/>
+                <w:color w:val="000000"/>
+                <w:sz w:val="22"/>
               </w:rPr>
               <w:t>llaves 1, '1', (1, 2), 2.5</w:t>
             </w:r>
@@ -3166,9 +4412,14 @@
             <w:tcW w:type="dxa" w:w="1728"/>
           </w:tcPr>
           <w:p>
+            <w:pPr>
+              <w:spacing w:line="240" w:lineRule="auto"/>
+            </w:pPr>
             <w:r>
               <w:rPr>
-                <w:sz w:val="18"/>
+                <w:rFonts w:ascii="Times New Roman" w:hAnsi="Times New Roman"/>
+                <w:color w:val="000000"/>
+                <w:sz w:val="22"/>
               </w:rPr>
               <w:t>cada una conserva su valor</w:t>
             </w:r>
@@ -3179,9 +4430,14 @@
             <w:tcW w:type="dxa" w:w="1728"/>
           </w:tcPr>
           <w:p>
+            <w:pPr>
+              <w:spacing w:line="240" w:lineRule="auto"/>
+            </w:pPr>
             <w:r>
               <w:rPr>
-                <w:sz w:val="18"/>
+                <w:rFonts w:ascii="Times New Roman" w:hAnsi="Times New Roman"/>
+                <w:color w:val="000000"/>
+                <w:sz w:val="22"/>
               </w:rPr>
               <w:t>OK</w:t>
             </w:r>
@@ -3194,9 +4450,14 @@
             <w:tcW w:type="dxa" w:w="1728"/>
           </w:tcPr>
           <w:p>
+            <w:pPr>
+              <w:spacing w:line="240" w:lineRule="auto"/>
+            </w:pPr>
             <w:r>
               <w:rPr>
-                <w:sz w:val="18"/>
+                <w:rFonts w:ascii="Times New Roman" w:hAnsi="Times New Roman"/>
+                <w:color w:val="000000"/>
+                <w:sz w:val="22"/>
               </w:rPr>
               <w:t>TablaHash</w:t>
             </w:r>
@@ -3207,9 +4468,14 @@
             <w:tcW w:type="dxa" w:w="1728"/>
           </w:tcPr>
           <w:p>
+            <w:pPr>
+              <w:spacing w:line="240" w:lineRule="auto"/>
+            </w:pPr>
             <w:r>
               <w:rPr>
-                <w:sz w:val="18"/>
+                <w:rFonts w:ascii="Times New Roman" w:hAnsi="Times New Roman"/>
+                <w:color w:val="000000"/>
+                <w:sz w:val="22"/>
               </w:rPr>
               <w:t>test_resize_despues_de_borrar</w:t>
             </w:r>
@@ -3220,9 +4486,14 @@
             <w:tcW w:type="dxa" w:w="1728"/>
           </w:tcPr>
           <w:p>
+            <w:pPr>
+              <w:spacing w:line="240" w:lineRule="auto"/>
+            </w:pPr>
             <w:r>
               <w:rPr>
-                <w:sz w:val="18"/>
+                <w:rFonts w:ascii="Times New Roman" w:hAnsi="Times New Roman"/>
+                <w:color w:val="000000"/>
+                <w:sz w:val="22"/>
               </w:rPr>
               <w:t>50 put, borrar pares, 50 put mas</w:t>
             </w:r>
@@ -3233,9 +4504,14 @@
             <w:tcW w:type="dxa" w:w="1728"/>
           </w:tcPr>
           <w:p>
+            <w:pPr>
+              <w:spacing w:line="240" w:lineRule="auto"/>
+            </w:pPr>
             <w:r>
               <w:rPr>
-                <w:sz w:val="18"/>
+                <w:rFonts w:ascii="Times New Roman" w:hAnsi="Times New Roman"/>
+                <w:color w:val="000000"/>
+                <w:sz w:val="22"/>
               </w:rPr>
               <w:t>keys impares primero, len 75, get 99 es 99</w:t>
             </w:r>
@@ -3246,9 +4522,14 @@
             <w:tcW w:type="dxa" w:w="1728"/>
           </w:tcPr>
           <w:p>
+            <w:pPr>
+              <w:spacing w:line="240" w:lineRule="auto"/>
+            </w:pPr>
             <w:r>
               <w:rPr>
-                <w:sz w:val="18"/>
+                <w:rFonts w:ascii="Times New Roman" w:hAnsi="Times New Roman"/>
+                <w:color w:val="000000"/>
+                <w:sz w:val="22"/>
               </w:rPr>
               <w:t>OK</w:t>
             </w:r>
@@ -3261,9 +4542,14 @@
             <w:tcW w:type="dxa" w:w="1728"/>
           </w:tcPr>
           <w:p>
+            <w:pPr>
+              <w:spacing w:line="240" w:lineRule="auto"/>
+            </w:pPr>
             <w:r>
               <w:rPr>
-                <w:sz w:val="18"/>
+                <w:rFonts w:ascii="Times New Roman" w:hAnsi="Times New Roman"/>
+                <w:color w:val="000000"/>
+                <w:sz w:val="22"/>
               </w:rPr>
               <w:t>TablaHash</w:t>
             </w:r>
@@ -3274,9 +4560,14 @@
             <w:tcW w:type="dxa" w:w="1728"/>
           </w:tcPr>
           <w:p>
+            <w:pPr>
+              <w:spacing w:line="240" w:lineRule="auto"/>
+            </w:pPr>
             <w:r>
               <w:rPr>
-                <w:sz w:val="18"/>
+                <w:rFonts w:ascii="Times New Roman" w:hAnsi="Times New Roman"/>
+                <w:color w:val="000000"/>
+                <w:sz w:val="22"/>
               </w:rPr>
               <w:t>test_clear</w:t>
             </w:r>
@@ -3287,9 +4578,14 @@
             <w:tcW w:type="dxa" w:w="1728"/>
           </w:tcPr>
           <w:p>
+            <w:pPr>
+              <w:spacing w:line="240" w:lineRule="auto"/>
+            </w:pPr>
             <w:r>
               <w:rPr>
-                <w:sz w:val="18"/>
+                <w:rFonts w:ascii="Times New Roman" w:hAnsi="Times New Roman"/>
+                <w:color w:val="000000"/>
+                <w:sz w:val="22"/>
               </w:rPr>
               <w:t>put a=1, clear, put b=2</w:t>
             </w:r>
@@ -3300,9 +4596,14 @@
             <w:tcW w:type="dxa" w:w="1728"/>
           </w:tcPr>
           <w:p>
+            <w:pPr>
+              <w:spacing w:line="240" w:lineRule="auto"/>
+            </w:pPr>
             <w:r>
               <w:rPr>
-                <w:sz w:val="18"/>
+                <w:rFonts w:ascii="Times New Roman" w:hAnsi="Times New Roman"/>
+                <w:color w:val="000000"/>
+                <w:sz w:val="22"/>
               </w:rPr>
               <w:t>a no existe, keys ['b']</w:t>
             </w:r>
@@ -3313,9 +4614,14 @@
             <w:tcW w:type="dxa" w:w="1728"/>
           </w:tcPr>
           <w:p>
+            <w:pPr>
+              <w:spacing w:line="240" w:lineRule="auto"/>
+            </w:pPr>
             <w:r>
               <w:rPr>
-                <w:sz w:val="18"/>
+                <w:rFonts w:ascii="Times New Roman" w:hAnsi="Times New Roman"/>
+                <w:color w:val="000000"/>
+                <w:sz w:val="22"/>
               </w:rPr>
               <w:t>OK</w:t>
             </w:r>
@@ -3328,9 +4634,14 @@
             <w:tcW w:type="dxa" w:w="1728"/>
           </w:tcPr>
           <w:p>
+            <w:pPr>
+              <w:spacing w:line="240" w:lineRule="auto"/>
+            </w:pPr>
             <w:r>
               <w:rPr>
-                <w:sz w:val="18"/>
+                <w:rFonts w:ascii="Times New Roman" w:hAnsi="Times New Roman"/>
+                <w:color w:val="000000"/>
+                <w:sz w:val="22"/>
               </w:rPr>
               <w:t>TablaHash</w:t>
             </w:r>
@@ -3341,9 +4652,14 @@
             <w:tcW w:type="dxa" w:w="1728"/>
           </w:tcPr>
           <w:p>
+            <w:pPr>
+              <w:spacing w:line="240" w:lineRule="auto"/>
+            </w:pPr>
             <w:r>
               <w:rPr>
-                <w:sz w:val="18"/>
+                <w:rFonts w:ascii="Times New Roman" w:hAnsi="Times New Roman"/>
+                <w:color w:val="000000"/>
+                <w:sz w:val="22"/>
               </w:rPr>
               <w:t>test_capacidad_invalida</w:t>
             </w:r>
@@ -3354,9 +4670,14 @@
             <w:tcW w:type="dxa" w:w="1728"/>
           </w:tcPr>
           <w:p>
+            <w:pPr>
+              <w:spacing w:line="240" w:lineRule="auto"/>
+            </w:pPr>
             <w:r>
               <w:rPr>
-                <w:sz w:val="18"/>
+                <w:rFonts w:ascii="Times New Roman" w:hAnsi="Times New Roman"/>
+                <w:color w:val="000000"/>
+                <w:sz w:val="22"/>
               </w:rPr>
               <w:t>TablaHash(capacidad=0)</w:t>
             </w:r>
@@ -3367,9 +4688,14 @@
             <w:tcW w:type="dxa" w:w="1728"/>
           </w:tcPr>
           <w:p>
+            <w:pPr>
+              <w:spacing w:line="240" w:lineRule="auto"/>
+            </w:pPr>
             <w:r>
               <w:rPr>
-                <w:sz w:val="18"/>
+                <w:rFonts w:ascii="Times New Roman" w:hAnsi="Times New Roman"/>
+                <w:color w:val="000000"/>
+                <w:sz w:val="22"/>
               </w:rPr>
               <w:t>ValueError</w:t>
             </w:r>
@@ -3380,9 +4706,14 @@
             <w:tcW w:type="dxa" w:w="1728"/>
           </w:tcPr>
           <w:p>
+            <w:pPr>
+              <w:spacing w:line="240" w:lineRule="auto"/>
+            </w:pPr>
             <w:r>
               <w:rPr>
-                <w:sz w:val="18"/>
+                <w:rFonts w:ascii="Times New Roman" w:hAnsi="Times New Roman"/>
+                <w:color w:val="000000"/>
+                <w:sz w:val="22"/>
               </w:rPr>
               <w:t>OK</w:t>
             </w:r>
@@ -3395,9 +4726,14 @@
             <w:tcW w:type="dxa" w:w="1728"/>
           </w:tcPr>
           <w:p>
+            <w:pPr>
+              <w:spacing w:line="240" w:lineRule="auto"/>
+            </w:pPr>
             <w:r>
               <w:rPr>
-                <w:sz w:val="18"/>
+                <w:rFonts w:ascii="Times New Roman" w:hAnsi="Times New Roman"/>
+                <w:color w:val="000000"/>
+                <w:sz w:val="22"/>
               </w:rPr>
               <w:t>TablaHash</w:t>
             </w:r>
@@ -3408,9 +4744,14 @@
             <w:tcW w:type="dxa" w:w="1728"/>
           </w:tcPr>
           <w:p>
+            <w:pPr>
+              <w:spacing w:line="240" w:lineRule="auto"/>
+            </w:pPr>
             <w:r>
               <w:rPr>
-                <w:sz w:val="18"/>
+                <w:rFonts w:ascii="Times New Roman" w:hAnsi="Times New Roman"/>
+                <w:color w:val="000000"/>
+                <w:sz w:val="22"/>
               </w:rPr>
               <w:t>test_repr</w:t>
             </w:r>
@@ -3421,9 +4762,14 @@
             <w:tcW w:type="dxa" w:w="1728"/>
           </w:tcPr>
           <w:p>
+            <w:pPr>
+              <w:spacing w:line="240" w:lineRule="auto"/>
+            </w:pPr>
             <w:r>
               <w:rPr>
-                <w:sz w:val="18"/>
+                <w:rFonts w:ascii="Times New Roman" w:hAnsi="Times New Roman"/>
+                <w:color w:val="000000"/>
+                <w:sz w:val="22"/>
               </w:rPr>
               <w:t>repr con a=1</w:t>
             </w:r>
@@ -3434,9 +4780,14 @@
             <w:tcW w:type="dxa" w:w="1728"/>
           </w:tcPr>
           <w:p>
+            <w:pPr>
+              <w:spacing w:line="240" w:lineRule="auto"/>
+            </w:pPr>
             <w:r>
               <w:rPr>
-                <w:sz w:val="18"/>
+                <w:rFonts w:ascii="Times New Roman" w:hAnsi="Times New Roman"/>
+                <w:color w:val="000000"/>
+                <w:sz w:val="22"/>
               </w:rPr>
               <w:t>TablaHash({'a': 1})</w:t>
             </w:r>
@@ -3447,9 +4798,14 @@
             <w:tcW w:type="dxa" w:w="1728"/>
           </w:tcPr>
           <w:p>
+            <w:pPr>
+              <w:spacing w:line="240" w:lineRule="auto"/>
+            </w:pPr>
             <w:r>
               <w:rPr>
-                <w:sz w:val="18"/>
+                <w:rFonts w:ascii="Times New Roman" w:hAnsi="Times New Roman"/>
+                <w:color w:val="000000"/>
+                <w:sz w:val="22"/>
               </w:rPr>
               <w:t>OK</w:t>
             </w:r>
@@ -3460,40 +4816,96 @@
     <w:p>
       <w:pPr>
         <w:pStyle w:val="Heading1"/>
+        <w:spacing w:line="480" w:lineRule="auto" w:before="0" w:after="0"/>
+        <w:jc w:val="center"/>
       </w:pPr>
       <w:r>
+        <w:rPr>
+          <w:rFonts w:ascii="Times New Roman" w:hAnsi="Times New Roman"/>
+          <w:b/>
+          <w:i w:val="0"/>
+          <w:color w:val="000000"/>
+          <w:sz w:val="24"/>
+        </w:rPr>
         <w:t>Cómo ejecutar</w:t>
       </w:r>
     </w:p>
     <w:p>
+      <w:pPr>
+        <w:spacing w:line="480" w:lineRule="auto" w:before="0" w:after="0"/>
+        <w:ind w:firstLine="720"/>
+        <w:jc w:val="left"/>
+      </w:pPr>
       <w:r>
+        <w:rPr>
+          <w:rFonts w:ascii="Times New Roman" w:hAnsi="Times New Roman"/>
+          <w:color w:val="000000"/>
+          <w:sz w:val="24"/>
+        </w:rPr>
         <w:t>Se necesita Python 3 (solo librería estándar). Desde la carpeta del proyecto:</w:t>
       </w:r>
     </w:p>
     <w:p>
       <w:pPr>
         <w:pStyle w:val="ListBullet"/>
+        <w:spacing w:line="480" w:lineRule="auto" w:before="0" w:after="0"/>
+        <w:jc w:val="left"/>
       </w:pPr>
       <w:r>
+        <w:rPr>
+          <w:rFonts w:ascii="Times New Roman" w:hAnsi="Times New Roman"/>
+          <w:color w:val="000000"/>
+          <w:sz w:val="24"/>
+        </w:rPr>
         <w:t>python demo.py</w:t>
       </w:r>
     </w:p>
     <w:p>
       <w:pPr>
         <w:pStyle w:val="ListBullet"/>
+        <w:spacing w:line="480" w:lineRule="auto" w:before="0" w:after="0"/>
+        <w:jc w:val="left"/>
       </w:pPr>
       <w:r>
+        <w:rPr>
+          <w:rFonts w:ascii="Times New Roman" w:hAnsi="Times New Roman"/>
+          <w:color w:val="000000"/>
+          <w:sz w:val="24"/>
+        </w:rPr>
         <w:t>python -m unittest -v</w:t>
       </w:r>
     </w:p>
     <w:sectPr>
+      <w:headerReference w:type="default" r:id="rId10"/>
       <w:pgSz w:w="12240" w:h="15840"/>
-      <w:pgMar w:top="1440" w:right="1800" w:bottom="1440" w:left="1800" w:header="720" w:footer="720" w:gutter="0"/>
+      <w:pgMar w:top="1440" w:right="1440" w:bottom="1440" w:left="1440" w:header="720" w:footer="720" w:gutter="0"/>
       <w:cols w:space="720"/>
       <w:docGrid w:linePitch="360"/>
     </w:sectPr>
   </w:body>
 </w:document>
+</file>
+
+<file path=word/header1.xml><?xml version="1.0" encoding="utf-8"?>
+<w:hdr xmlns:m="http://schemas.openxmlformats.org/officeDocument/2006/math" xmlns:mc="http://schemas.openxmlformats.org/markup-compatibility/2006" xmlns:mo="http://schemas.microsoft.com/office/mac/office/2008/main" xmlns:mv="urn:schemas-microsoft-com:mac:vml" xmlns:o="urn:schemas-microsoft-com:office:office" xmlns:r="http://schemas.openxmlformats.org/officeDocument/2006/relationships" xmlns:v="urn:schemas-microsoft-com:vml" xmlns:w10="urn:schemas-microsoft-com:office:word" xmlns:w14="http://schemas.microsoft.com/office/word/2010/wordml" xmlns:w="http://schemas.openxmlformats.org/wordprocessingml/2006/main" xmlns:wne="http://schemas.microsoft.com/office/word/2006/wordml" xmlns:wp14="http://schemas.microsoft.com/office/word/2010/wordprocessingDrawing" xmlns:wp="http://schemas.openxmlformats.org/drawingml/2006/wordprocessingDrawing" xmlns:wpc="http://schemas.microsoft.com/office/word/2010/wordprocessingCanvas" xmlns:wpg="http://schemas.microsoft.com/office/word/2010/wordprocessingGroup" xmlns:wpi="http://schemas.microsoft.com/office/word/2010/wordprocessingInk" xmlns:wps="http://schemas.microsoft.com/office/word/2010/wordprocessingShape" mc:Ignorable="w14 wp14">
+  <w:p>
+    <w:pPr>
+      <w:pStyle w:val="Header"/>
+      <w:jc w:val="right"/>
+    </w:pPr>
+    <w:r/>
+    <w:r>
+      <w:rPr>
+        <w:rFonts w:ascii="Times New Roman" w:hAnsi="Times New Roman"/>
+        <w:color w:val="000000"/>
+        <w:sz w:val="24"/>
+      </w:rPr>
+      <w:fldChar w:fldCharType="begin"/>
+      <w:instrText xml:space="preserve">PAGE</w:instrText>
+      <w:fldChar w:fldCharType="end"/>
+    </w:r>
+  </w:p>
+</w:hdr>
 </file>
 
 <file path=word/numbering.xml><?xml version="1.0" encoding="utf-8"?>
@@ -3860,8 +5272,9 @@
     <w:qFormat/>
     <w:rsid w:val="00FC693F"/>
     <w:rPr>
-      <w:rFonts w:ascii="Calibri" w:hAnsi="Calibri"/>
-      <w:sz w:val="22"/>
+      <w:rFonts w:ascii="Times New Roman" w:hAnsi="Times New Roman" w:eastAsia="Times New Roman" w:cs="Times New Roman"/>
+      <w:color w:val="000000"/>
+      <w:sz w:val="24"/>
     </w:rPr>
   </w:style>
   <w:style w:type="paragraph" w:styleId="Header">
@@ -3878,6 +5291,11 @@
       </w:tabs>
       <w:spacing w:after="0" w:line="240" w:lineRule="auto"/>
     </w:pPr>
+    <w:rPr>
+      <w:rFonts w:ascii="Times New Roman" w:hAnsi="Times New Roman" w:eastAsia="Times New Roman" w:cs="Times New Roman"/>
+      <w:color w:val="000000"/>
+      <w:sz w:val="24"/>
+    </w:rPr>
   </w:style>
   <w:style w:type="character" w:customStyle="1" w:styleId="HeaderChar">
     <w:name w:val="Header Char"/>
@@ -3900,6 +5318,11 @@
       </w:tabs>
       <w:spacing w:after="0" w:line="240" w:lineRule="auto"/>
     </w:pPr>
+    <w:rPr>
+      <w:rFonts w:ascii="Times New Roman" w:hAnsi="Times New Roman" w:eastAsia="Times New Roman" w:cs="Times New Roman"/>
+      <w:color w:val="000000"/>
+      <w:sz w:val="24"/>
+    </w:rPr>
   </w:style>
   <w:style w:type="character" w:customStyle="1" w:styleId="FooterChar">
     <w:name w:val="Footer Char"/>
@@ -3923,11 +5346,11 @@
       <w:outlineLvl w:val="0"/>
     </w:pPr>
     <w:rPr>
-      <w:rFonts w:asciiTheme="majorHAnsi" w:eastAsiaTheme="majorEastAsia" w:hAnsiTheme="majorHAnsi" w:cstheme="majorBidi"/>
+      <w:rFonts w:ascii="Times New Roman" w:hAnsi="Times New Roman" w:eastAsia="Times New Roman" w:cs="Times New Roman"/>
       <w:b/>
       <w:bCs/>
-      <w:color w:val="365F91" w:themeColor="accent1" w:themeShade="BF"/>
-      <w:sz w:val="28"/>
+      <w:color w:val="000000"/>
+      <w:sz w:val="24"/>
       <w:szCs w:val="28"/>
     </w:rPr>
   </w:style>
@@ -3947,11 +5370,11 @@
       <w:outlineLvl w:val="1"/>
     </w:pPr>
     <w:rPr>
-      <w:rFonts w:asciiTheme="majorHAnsi" w:eastAsiaTheme="majorEastAsia" w:hAnsiTheme="majorHAnsi" w:cstheme="majorBidi"/>
+      <w:rFonts w:ascii="Times New Roman" w:hAnsi="Times New Roman" w:eastAsia="Times New Roman" w:cs="Times New Roman"/>
       <w:b/>
       <w:bCs/>
-      <w:color w:val="4F81BD" w:themeColor="accent1"/>
-      <w:sz w:val="26"/>
+      <w:color w:val="000000"/>
+      <w:sz w:val="24"/>
       <w:szCs w:val="26"/>
     </w:rPr>
   </w:style>
@@ -3971,10 +5394,11 @@
       <w:outlineLvl w:val="2"/>
     </w:pPr>
     <w:rPr>
-      <w:rFonts w:asciiTheme="majorHAnsi" w:eastAsiaTheme="majorEastAsia" w:hAnsiTheme="majorHAnsi" w:cstheme="majorBidi"/>
+      <w:rFonts w:ascii="Times New Roman" w:hAnsi="Times New Roman" w:eastAsia="Times New Roman" w:cs="Times New Roman"/>
       <w:b/>
       <w:bCs/>
-      <w:color w:val="4F81BD" w:themeColor="accent1"/>
+      <w:color w:val="000000"/>
+      <w:sz w:val="24"/>
     </w:rPr>
   </w:style>
   <w:style w:type="paragraph" w:styleId="Heading4">
@@ -3994,12 +5418,13 @@
       <w:outlineLvl w:val="3"/>
     </w:pPr>
     <w:rPr>
-      <w:rFonts w:asciiTheme="majorHAnsi" w:eastAsiaTheme="majorEastAsia" w:hAnsiTheme="majorHAnsi" w:cstheme="majorBidi"/>
+      <w:rFonts w:ascii="Times New Roman" w:hAnsi="Times New Roman" w:eastAsia="Times New Roman" w:cs="Times New Roman"/>
       <w:b/>
       <w:bCs/>
       <w:i/>
       <w:iCs/>
-      <w:color w:val="4F81BD" w:themeColor="accent1"/>
+      <w:color w:val="000000"/>
+      <w:sz w:val="24"/>
     </w:rPr>
   </w:style>
   <w:style w:type="paragraph" w:styleId="Heading5">
@@ -4019,8 +5444,9 @@
       <w:outlineLvl w:val="4"/>
     </w:pPr>
     <w:rPr>
-      <w:rFonts w:asciiTheme="majorHAnsi" w:eastAsiaTheme="majorEastAsia" w:hAnsiTheme="majorHAnsi" w:cstheme="majorBidi"/>
-      <w:color w:val="243F60" w:themeColor="accent1" w:themeShade="7F"/>
+      <w:rFonts w:ascii="Times New Roman" w:hAnsi="Times New Roman" w:eastAsia="Times New Roman" w:cs="Times New Roman"/>
+      <w:color w:val="000000"/>
+      <w:sz w:val="24"/>
     </w:rPr>
   </w:style>
   <w:style w:type="paragraph" w:styleId="Heading6">
@@ -4040,10 +5466,11 @@
       <w:outlineLvl w:val="5"/>
     </w:pPr>
     <w:rPr>
-      <w:rFonts w:asciiTheme="majorHAnsi" w:eastAsiaTheme="majorEastAsia" w:hAnsiTheme="majorHAnsi" w:cstheme="majorBidi"/>
+      <w:rFonts w:ascii="Times New Roman" w:hAnsi="Times New Roman" w:eastAsia="Times New Roman" w:cs="Times New Roman"/>
       <w:i/>
       <w:iCs/>
-      <w:color w:val="243F60" w:themeColor="accent1" w:themeShade="7F"/>
+      <w:color w:val="000000"/>
+      <w:sz w:val="24"/>
     </w:rPr>
   </w:style>
   <w:style w:type="paragraph" w:styleId="Heading7">
@@ -4063,10 +5490,11 @@
       <w:outlineLvl w:val="6"/>
     </w:pPr>
     <w:rPr>
-      <w:rFonts w:asciiTheme="majorHAnsi" w:eastAsiaTheme="majorEastAsia" w:hAnsiTheme="majorHAnsi" w:cstheme="majorBidi"/>
+      <w:rFonts w:ascii="Times New Roman" w:hAnsi="Times New Roman" w:eastAsia="Times New Roman" w:cs="Times New Roman"/>
       <w:i/>
       <w:iCs/>
-      <w:color w:val="404040" w:themeColor="text1" w:themeTint="BF"/>
+      <w:color w:val="000000"/>
+      <w:sz w:val="24"/>
     </w:rPr>
   </w:style>
   <w:style w:type="paragraph" w:styleId="Heading8">
@@ -4086,9 +5514,9 @@
       <w:outlineLvl w:val="7"/>
     </w:pPr>
     <w:rPr>
-      <w:rFonts w:asciiTheme="majorHAnsi" w:eastAsiaTheme="majorEastAsia" w:hAnsiTheme="majorHAnsi" w:cstheme="majorBidi"/>
-      <w:color w:val="4F81BD" w:themeColor="accent1"/>
-      <w:sz w:val="20"/>
+      <w:rFonts w:ascii="Times New Roman" w:hAnsi="Times New Roman" w:eastAsia="Times New Roman" w:cs="Times New Roman"/>
+      <w:color w:val="000000"/>
+      <w:sz w:val="24"/>
       <w:szCs w:val="20"/>
     </w:rPr>
   </w:style>
@@ -4109,11 +5537,11 @@
       <w:outlineLvl w:val="8"/>
     </w:pPr>
     <w:rPr>
-      <w:rFonts w:asciiTheme="majorHAnsi" w:eastAsiaTheme="majorEastAsia" w:hAnsiTheme="majorHAnsi" w:cstheme="majorBidi"/>
+      <w:rFonts w:ascii="Times New Roman" w:hAnsi="Times New Roman" w:eastAsia="Times New Roman" w:cs="Times New Roman"/>
       <w:i/>
       <w:iCs/>
-      <w:color w:val="404040" w:themeColor="text1" w:themeTint="BF"/>
-      <w:sz w:val="20"/>
+      <w:color w:val="000000"/>
+      <w:sz w:val="24"/>
       <w:szCs w:val="20"/>
     </w:rPr>
   </w:style>
@@ -4152,6 +5580,11 @@
     <w:pPr>
       <w:spacing w:after="0" w:line="240" w:lineRule="auto"/>
     </w:pPr>
+    <w:rPr>
+      <w:rFonts w:ascii="Times New Roman" w:hAnsi="Times New Roman" w:eastAsia="Times New Roman" w:cs="Times New Roman"/>
+      <w:color w:val="000000"/>
+      <w:sz w:val="24"/>
+    </w:rPr>
   </w:style>
   <w:style w:type="character" w:customStyle="1" w:styleId="Heading1Char">
     <w:name w:val="Heading 1 Char"/>
@@ -4212,11 +5645,11 @@
       <w:contextualSpacing/>
     </w:pPr>
     <w:rPr>
-      <w:rFonts w:asciiTheme="majorHAnsi" w:eastAsiaTheme="majorEastAsia" w:hAnsiTheme="majorHAnsi" w:cstheme="majorBidi"/>
-      <w:color w:val="17365D" w:themeColor="text2" w:themeShade="BF"/>
+      <w:rFonts w:ascii="Times New Roman" w:hAnsi="Times New Roman" w:eastAsia="Times New Roman" w:cs="Times New Roman"/>
+      <w:color w:val="000000"/>
       <w:spacing w:val="5"/>
       <w:kern w:val="28"/>
-      <w:sz w:val="52"/>
+      <w:sz w:val="24"/>
       <w:szCs w:val="52"/>
     </w:rPr>
   </w:style>
@@ -4249,10 +5682,10 @@
       </w:numPr>
     </w:pPr>
     <w:rPr>
-      <w:rFonts w:asciiTheme="majorHAnsi" w:eastAsiaTheme="majorEastAsia" w:hAnsiTheme="majorHAnsi" w:cstheme="majorBidi"/>
+      <w:rFonts w:ascii="Times New Roman" w:hAnsi="Times New Roman" w:eastAsia="Times New Roman" w:cs="Times New Roman"/>
       <w:i/>
       <w:iCs/>
-      <w:color w:val="4F81BD" w:themeColor="accent1"/>
+      <w:color w:val="000000"/>
       <w:spacing w:val="15"/>
       <w:sz w:val="24"/>
       <w:szCs w:val="24"/>
@@ -4284,6 +5717,11 @@
       <w:ind w:left="720"/>
       <w:contextualSpacing/>
     </w:pPr>
+    <w:rPr>
+      <w:rFonts w:ascii="Times New Roman" w:hAnsi="Times New Roman" w:eastAsia="Times New Roman" w:cs="Times New Roman"/>
+      <w:color w:val="000000"/>
+      <w:sz w:val="24"/>
+    </w:rPr>
   </w:style>
   <w:style w:type="paragraph" w:styleId="BodyText">
     <w:name w:val="Body Text"/>
@@ -4295,6 +5733,11 @@
     <w:pPr>
       <w:spacing w:after="120"/>
     </w:pPr>
+    <w:rPr>
+      <w:rFonts w:ascii="Times New Roman" w:hAnsi="Times New Roman" w:eastAsia="Times New Roman" w:cs="Times New Roman"/>
+      <w:color w:val="000000"/>
+      <w:sz w:val="24"/>
+    </w:rPr>
   </w:style>
   <w:style w:type="character" w:customStyle="1" w:styleId="BodyTextChar">
     <w:name w:val="Body Text Char"/>
@@ -4313,6 +5756,11 @@
     <w:pPr>
       <w:spacing w:after="120" w:line="480" w:lineRule="auto"/>
     </w:pPr>
+    <w:rPr>
+      <w:rFonts w:ascii="Times New Roman" w:hAnsi="Times New Roman" w:eastAsia="Times New Roman" w:cs="Times New Roman"/>
+      <w:color w:val="000000"/>
+      <w:sz w:val="24"/>
+    </w:rPr>
   </w:style>
   <w:style w:type="character" w:customStyle="1" w:styleId="BodyText2Char">
     <w:name w:val="Body Text 2 Char"/>
@@ -4332,7 +5780,9 @@
       <w:spacing w:after="120"/>
     </w:pPr>
     <w:rPr>
-      <w:sz w:val="16"/>
+      <w:rFonts w:ascii="Times New Roman" w:hAnsi="Times New Roman" w:eastAsia="Times New Roman" w:cs="Times New Roman"/>
+      <w:color w:val="000000"/>
+      <w:sz w:val="24"/>
       <w:szCs w:val="16"/>
     </w:rPr>
   </w:style>
@@ -4357,6 +5807,11 @@
       <w:ind w:left="360" w:hanging="360"/>
       <w:contextualSpacing/>
     </w:pPr>
+    <w:rPr>
+      <w:rFonts w:ascii="Times New Roman" w:hAnsi="Times New Roman" w:eastAsia="Times New Roman" w:cs="Times New Roman"/>
+      <w:color w:val="000000"/>
+      <w:sz w:val="24"/>
+    </w:rPr>
   </w:style>
   <w:style w:type="paragraph" w:styleId="List2">
     <w:name w:val="List 2"/>
@@ -4368,6 +5823,11 @@
       <w:ind w:left="720" w:hanging="360"/>
       <w:contextualSpacing/>
     </w:pPr>
+    <w:rPr>
+      <w:rFonts w:ascii="Times New Roman" w:hAnsi="Times New Roman" w:eastAsia="Times New Roman" w:cs="Times New Roman"/>
+      <w:color w:val="000000"/>
+      <w:sz w:val="24"/>
+    </w:rPr>
   </w:style>
   <w:style w:type="paragraph" w:styleId="List3">
     <w:name w:val="List 3"/>
@@ -4379,6 +5839,11 @@
       <w:ind w:left="1080" w:hanging="360"/>
       <w:contextualSpacing/>
     </w:pPr>
+    <w:rPr>
+      <w:rFonts w:ascii="Times New Roman" w:hAnsi="Times New Roman" w:eastAsia="Times New Roman" w:cs="Times New Roman"/>
+      <w:color w:val="000000"/>
+      <w:sz w:val="24"/>
+    </w:rPr>
   </w:style>
   <w:style w:type="paragraph" w:styleId="ListBullet">
     <w:name w:val="List Bullet"/>
@@ -4392,6 +5857,11 @@
       </w:numPr>
       <w:contextualSpacing/>
     </w:pPr>
+    <w:rPr>
+      <w:rFonts w:ascii="Times New Roman" w:hAnsi="Times New Roman" w:eastAsia="Times New Roman" w:cs="Times New Roman"/>
+      <w:color w:val="000000"/>
+      <w:sz w:val="24"/>
+    </w:rPr>
   </w:style>
   <w:style w:type="paragraph" w:styleId="ListBullet2">
     <w:name w:val="List Bullet 2"/>
@@ -4405,6 +5875,11 @@
       </w:numPr>
       <w:contextualSpacing/>
     </w:pPr>
+    <w:rPr>
+      <w:rFonts w:ascii="Times New Roman" w:hAnsi="Times New Roman" w:eastAsia="Times New Roman" w:cs="Times New Roman"/>
+      <w:color w:val="000000"/>
+      <w:sz w:val="24"/>
+    </w:rPr>
   </w:style>
   <w:style w:type="paragraph" w:styleId="ListBullet3">
     <w:name w:val="List Bullet 3"/>
@@ -4418,6 +5893,11 @@
       </w:numPr>
       <w:contextualSpacing/>
     </w:pPr>
+    <w:rPr>
+      <w:rFonts w:ascii="Times New Roman" w:hAnsi="Times New Roman" w:eastAsia="Times New Roman" w:cs="Times New Roman"/>
+      <w:color w:val="000000"/>
+      <w:sz w:val="24"/>
+    </w:rPr>
   </w:style>
   <w:style w:type="paragraph" w:styleId="ListNumber">
     <w:name w:val="List Number"/>
@@ -4431,6 +5911,11 @@
       </w:numPr>
       <w:contextualSpacing/>
     </w:pPr>
+    <w:rPr>
+      <w:rFonts w:ascii="Times New Roman" w:hAnsi="Times New Roman" w:eastAsia="Times New Roman" w:cs="Times New Roman"/>
+      <w:color w:val="000000"/>
+      <w:sz w:val="24"/>
+    </w:rPr>
   </w:style>
   <w:style w:type="paragraph" w:styleId="ListNumber2">
     <w:name w:val="List Number 2"/>
@@ -4444,6 +5929,11 @@
       </w:numPr>
       <w:contextualSpacing/>
     </w:pPr>
+    <w:rPr>
+      <w:rFonts w:ascii="Times New Roman" w:hAnsi="Times New Roman" w:eastAsia="Times New Roman" w:cs="Times New Roman"/>
+      <w:color w:val="000000"/>
+      <w:sz w:val="24"/>
+    </w:rPr>
   </w:style>
   <w:style w:type="paragraph" w:styleId="ListNumber3">
     <w:name w:val="List Number 3"/>
@@ -4457,6 +5947,11 @@
       </w:numPr>
       <w:contextualSpacing/>
     </w:pPr>
+    <w:rPr>
+      <w:rFonts w:ascii="Times New Roman" w:hAnsi="Times New Roman" w:eastAsia="Times New Roman" w:cs="Times New Roman"/>
+      <w:color w:val="000000"/>
+      <w:sz w:val="24"/>
+    </w:rPr>
   </w:style>
   <w:style w:type="paragraph" w:styleId="ListContinue">
     <w:name w:val="List Continue"/>
@@ -4469,6 +5964,11 @@
       <w:ind w:left="360"/>
       <w:contextualSpacing/>
     </w:pPr>
+    <w:rPr>
+      <w:rFonts w:ascii="Times New Roman" w:hAnsi="Times New Roman" w:eastAsia="Times New Roman" w:cs="Times New Roman"/>
+      <w:color w:val="000000"/>
+      <w:sz w:val="24"/>
+    </w:rPr>
   </w:style>
   <w:style w:type="paragraph" w:styleId="ListContinue2">
     <w:name w:val="List Continue 2"/>
@@ -4481,6 +5981,11 @@
       <w:ind w:left="720"/>
       <w:contextualSpacing/>
     </w:pPr>
+    <w:rPr>
+      <w:rFonts w:ascii="Times New Roman" w:hAnsi="Times New Roman" w:eastAsia="Times New Roman" w:cs="Times New Roman"/>
+      <w:color w:val="000000"/>
+      <w:sz w:val="24"/>
+    </w:rPr>
   </w:style>
   <w:style w:type="paragraph" w:styleId="ListContinue3">
     <w:name w:val="List Continue 3"/>
@@ -4493,6 +5998,11 @@
       <w:ind w:left="1080"/>
       <w:contextualSpacing/>
     </w:pPr>
+    <w:rPr>
+      <w:rFonts w:ascii="Times New Roman" w:hAnsi="Times New Roman" w:eastAsia="Times New Roman" w:cs="Times New Roman"/>
+      <w:color w:val="000000"/>
+      <w:sz w:val="24"/>
+    </w:rPr>
   </w:style>
   <w:style w:type="paragraph" w:styleId="MacroText">
     <w:name w:val="macro"/>
@@ -4512,8 +6022,9 @@
       </w:tabs>
     </w:pPr>
     <w:rPr>
-      <w:rFonts w:ascii="Courier" w:hAnsi="Courier"/>
-      <w:sz w:val="20"/>
+      <w:rFonts w:ascii="Times New Roman" w:hAnsi="Times New Roman" w:eastAsia="Times New Roman" w:cs="Times New Roman"/>
+      <w:color w:val="000000"/>
+      <w:sz w:val="24"/>
       <w:szCs w:val="20"/>
     </w:rPr>
   </w:style>
@@ -4538,9 +6049,11 @@
     <w:qFormat/>
     <w:rsid w:val="00FC693F"/>
     <w:rPr>
+      <w:rFonts w:ascii="Times New Roman" w:hAnsi="Times New Roman" w:eastAsia="Times New Roman" w:cs="Times New Roman"/>
       <w:i/>
       <w:iCs/>
-      <w:color w:val="000000" w:themeColor="text1"/>
+      <w:color w:val="000000"/>
+      <w:sz w:val="24"/>
     </w:rPr>
   </w:style>
   <w:style w:type="character" w:customStyle="1" w:styleId="QuoteChar">
@@ -4654,10 +6167,11 @@
       <w:spacing w:line="240" w:lineRule="auto"/>
     </w:pPr>
     <w:rPr>
+      <w:rFonts w:ascii="Times New Roman" w:hAnsi="Times New Roman" w:eastAsia="Times New Roman" w:cs="Times New Roman"/>
       <w:b/>
       <w:bCs/>
-      <w:color w:val="4F81BD" w:themeColor="accent1"/>
-      <w:sz w:val="18"/>
+      <w:color w:val="000000"/>
+      <w:sz w:val="24"/>
       <w:szCs w:val="18"/>
     </w:rPr>
   </w:style>
@@ -4699,11 +6213,13 @@
       <w:ind w:left="936" w:right="936"/>
     </w:pPr>
     <w:rPr>
+      <w:rFonts w:ascii="Times New Roman" w:hAnsi="Times New Roman" w:eastAsia="Times New Roman" w:cs="Times New Roman"/>
       <w:b/>
       <w:bCs/>
       <w:i/>
       <w:iCs/>
-      <w:color w:val="4F81BD" w:themeColor="accent1"/>
+      <w:color w:val="000000"/>
+      <w:sz w:val="24"/>
     </w:rPr>
   </w:style>
   <w:style w:type="character" w:customStyle="1" w:styleId="IntenseQuoteChar">
@@ -4798,6 +6314,11 @@
     <w:pPr>
       <w:outlineLvl w:val="9"/>
     </w:pPr>
+    <w:rPr>
+      <w:rFonts w:ascii="Times New Roman" w:hAnsi="Times New Roman" w:eastAsia="Times New Roman" w:cs="Times New Roman"/>
+      <w:color w:val="000000"/>
+      <w:sz w:val="24"/>
+    </w:rPr>
   </w:style>
   <w:style w:type="table" w:styleId="TableGrid">
     <w:name w:val="Table Grid"/>

</xml_diff>